<commit_message>
clarify that RCTs may lead to shorter time frames; longer time frames might necessitate observational studies
</commit_message>
<xml_diff>
--- a/be-less-wrong/be-less-wrong.docx
+++ b/be-less-wrong/be-less-wrong.docx
@@ -31,10 +31,10 @@
         <w:pStyle w:val="Date"/>
       </w:pPr>
       <w:r>
-        <w:t xml:space="preserve">2026-02-18</w:t>
-      </w:r>
-    </w:p>
-    <w:bookmarkStart w:id="20" w:name="cr-martinbaro"/>
+        <w:t xml:space="preserve">2026-03-13</w:t>
+      </w:r>
+    </w:p>
+    <w:bookmarkStart w:id="9" w:name="cr-martinbaro"/>
     <w:p>
       <w:pPr>
         <w:pStyle w:val="BlockText"/>
@@ -49,7 +49,7 @@
         <w:t xml:space="preserve">(Martín-Baró, 1994)</w:t>
       </w:r>
     </w:p>
-    <w:bookmarkEnd w:id="20"/>
+    <w:bookmarkEnd w:id="9"/>
     <w:p>
       <w:pPr>
         <w:pStyle w:val="FirstParagraph"/>
@@ -74,8 +74,8 @@
         <w:t xml:space="preserve">of abuse, neglect, suffering, exploitation, violence, discrimination, and other associated problems that we are trying to understand, and to reduce.</w:t>
       </w:r>
     </w:p>
-    <w:bookmarkStart w:id="21" w:name="cr-earth"/>
-    <w:bookmarkEnd w:id="21"/>
+    <w:bookmarkStart w:id="10" w:name="cr-earth"/>
+    <w:bookmarkEnd w:id="10"/>
     <w:p>
       <w:pPr>
         <w:pStyle w:val="BodyText"/>
@@ -162,7 +162,7 @@
         <w:t xml:space="preserve">wrote:</w:t>
       </w:r>
     </w:p>
-    <w:bookmarkStart w:id="22" w:name="cr-silverman"/>
+    <w:bookmarkStart w:id="11" w:name="cr-silverman"/>
     <w:p>
       <w:pPr>
         <w:pStyle w:val="BlockText"/>
@@ -189,7 +189,7 @@
         <w:t xml:space="preserve">(Silverman, 1998)</w:t>
       </w:r>
     </w:p>
-    <w:bookmarkEnd w:id="22"/>
+    <w:bookmarkEnd w:id="11"/>
     <w:p>
       <w:pPr>
         <w:pStyle w:val="FirstParagraph"/>
@@ -207,7 +207,7 @@
         <w:t xml:space="preserve">:</w:t>
       </w:r>
     </w:p>
-    <w:bookmarkStart w:id="23" w:name="cr-box"/>
+    <w:bookmarkStart w:id="12" w:name="cr-box"/>
     <w:p>
       <w:pPr>
         <w:pStyle w:val="BlockText"/>
@@ -243,7 +243,7 @@
         <w:t xml:space="preserve">(Hand, 2014)</w:t>
       </w:r>
     </w:p>
-    <w:bookmarkEnd w:id="23"/>
+    <w:bookmarkEnd w:id="12"/>
     <w:p>
       <w:pPr>
         <w:pStyle w:val="FirstParagraph"/>
@@ -268,7 +268,7 @@
         <w:t xml:space="preserve">in the discoveries we are making about social issues.</w:t>
       </w:r>
     </w:p>
-    <w:bookmarkStart w:id="24" w:name="cr-box2"/>
+    <w:bookmarkStart w:id="13" w:name="cr-box2"/>
     <w:p>
       <w:pPr>
         <w:pStyle w:val="BlockText"/>
@@ -283,7 +283,7 @@
         <w:t xml:space="preserve">(Box, 1979)</w:t>
       </w:r>
     </w:p>
-    <w:bookmarkEnd w:id="24"/>
+    <w:bookmarkEnd w:id="13"/>
     <w:p>
       <w:pPr>
         <w:pStyle w:val="FirstParagraph"/>
@@ -324,7 +324,7 @@
         <w:t xml:space="preserve">(an improved or beneficial mental health or psychological outcome).</w:t>
       </w:r>
     </w:p>
-    <w:bookmarkStart w:id="28" w:name="cr-flowchart"/>
+    <w:bookmarkStart w:id="17" w:name="cr-flowchart"/>
     <w:p>
       <w:pPr>
         <w:pStyle w:val="BodyText"/>
@@ -339,18 +339,18 @@
           <wp:inline>
             <wp:extent cx="2670048" cy="694944"/>
             <wp:effectExtent b="0" l="0" r="0" t="0"/>
-            <wp:docPr descr="" title="" id="26" name="Picture"/>
+            <wp:docPr descr="" title="" id="15" name="Picture"/>
             <a:graphic>
               <a:graphicData uri="http://schemas.openxmlformats.org/drawingml/2006/picture">
                 <pic:pic>
                   <pic:nvPicPr>
-                    <pic:cNvPr descr="be-less-wrong_files/figure-docx/mermaid-figure-1.png" id="27" name="Picture"/>
+                    <pic:cNvPr descr="be-less-wrong_files/figure-docx/mermaid-figure-1.png" id="16" name="Picture"/>
                     <pic:cNvPicPr>
                       <a:picLocks noChangeArrowheads="1" noChangeAspect="1"/>
                     </pic:cNvPicPr>
                   </pic:nvPicPr>
                   <pic:blipFill>
-                    <a:blip r:embed="rId25"/>
+                    <a:blip r:embed="rId14"/>
                     <a:stretch>
                       <a:fillRect/>
                     </a:stretch>
@@ -382,7 +382,7 @@
         <w:pStyle w:val="BodyText"/>
       </w:pPr>
     </w:p>
-    <w:bookmarkEnd w:id="28"/>
+    <w:bookmarkEnd w:id="17"/>
     <w:p>
       <w:pPr>
         <w:pStyle w:val="BodyText"/>
@@ -420,7 +420,7 @@
         <w:t xml:space="preserve">?</w:t>
       </w:r>
     </w:p>
-    <w:bookmarkStart w:id="34" w:name="cr-p0"/>
+    <w:bookmarkStart w:id="23" w:name="cr-p0"/>
     <w:tbl>
       <w:tblPr>
         <w:tblStyle w:val="Table"/>
@@ -434,30 +434,30 @@
       <w:tr>
         <w:tc>
           <w:tcPr/>
-          <w:bookmarkStart w:id="33" w:name="fig-p0"/>
+          <w:bookmarkStart w:id="22" w:name="fig-p0"/>
           <w:p>
             <w:pPr>
               <w:pStyle w:val="Compact"/>
               <w:jc w:val="center"/>
             </w:pPr>
-            <w:bookmarkStart w:id="32" w:name="fig-p0"/>
+            <w:bookmarkStart w:id="21" w:name="fig-p0"/>
             <w:r>
               <w:drawing>
                 <wp:inline>
                   <wp:extent cx="5334000" cy="3200400"/>
                   <wp:effectExtent b="0" l="0" r="0" t="0"/>
-                  <wp:docPr descr="" title="" id="30" name="Picture"/>
+                  <wp:docPr descr="" title="" id="19" name="Picture"/>
                   <a:graphic>
                     <a:graphicData uri="http://schemas.openxmlformats.org/drawingml/2006/picture">
                       <pic:pic>
                         <pic:nvPicPr>
-                          <pic:cNvPr descr="be-less-wrong_files/figure-docx/fig-p0-1.png" id="31" name="Picture"/>
+                          <pic:cNvPr descr="be-less-wrong_files/figure-docx/fig-p0-1.png" id="20" name="Picture"/>
                           <pic:cNvPicPr>
                             <a:picLocks noChangeArrowheads="1" noChangeAspect="1"/>
                           </pic:cNvPicPr>
                         </pic:nvPicPr>
                         <pic:blipFill>
-                          <a:blip r:embed="rId29"/>
+                          <a:blip r:embed="rId18"/>
                           <a:stretch>
                             <a:fillRect/>
                           </a:stretch>
@@ -483,14 +483,14 @@
                 </wp:inline>
               </w:drawing>
             </w:r>
-            <w:bookmarkEnd w:id="32"/>
+            <w:bookmarkEnd w:id="21"/>
           </w:p>
           <w:p>
             <w:pPr>
               <w:jc w:val="center"/>
             </w:pPr>
             <w:pPr>
-              <w:jc w:val="start"/>
+              <w:jc w:val="left"/>
               <w:spacing w:before="200"/>
               <w:pStyle w:val="ImageCaption"/>
             </w:pPr>
@@ -498,11 +498,11 @@
               <w:t xml:space="preserve">Figure 1</w:t>
             </w:r>
           </w:p>
-          <w:bookmarkEnd w:id="33"/>
+          <w:bookmarkEnd w:id="22"/>
         </w:tc>
       </w:tr>
     </w:tbl>
-    <w:bookmarkEnd w:id="34"/>
+    <w:bookmarkEnd w:id="23"/>
     <w:p>
       <w:pPr>
         <w:pStyle w:val="BodyText"/>
@@ -540,8 +540,8 @@
         <w:t xml:space="preserve">.</w:t>
       </w:r>
     </w:p>
-    <w:bookmarkStart w:id="36" w:name="cr-notrecommended"/>
-    <w:bookmarkStart w:id="35" w:name="the-intervention-is-not-recommended"/>
+    <w:bookmarkStart w:id="25" w:name="cr-notrecommended"/>
+    <w:bookmarkStart w:id="24" w:name="the-intervention-is-not-recommended"/>
     <w:p>
       <w:pPr>
         <w:pStyle w:val="Heading2"/>
@@ -590,8 +590,8 @@
         <w:t xml:space="preserve">recommend using this intervention.</w:t>
       </w:r>
     </w:p>
-    <w:bookmarkEnd w:id="35"/>
-    <w:bookmarkEnd w:id="36"/>
+    <w:bookmarkEnd w:id="24"/>
+    <w:bookmarkEnd w:id="25"/>
     <w:p>
       <w:pPr>
         <w:pStyle w:val="BodyText"/>
@@ -642,7 +642,7 @@
         <w:t xml:space="preserve">. This could be any kind of group, e.g. a racial, ethnic, religious, cultural, or economic group.</w:t>
       </w:r>
     </w:p>
-    <w:bookmarkStart w:id="40" w:name="cr-flowchart2"/>
+    <w:bookmarkStart w:id="29" w:name="cr-flowchart2"/>
     <w:p>
       <w:pPr>
         <w:pStyle w:val="BodyText"/>
@@ -655,20 +655,20 @@
       <w:r>
         <w:drawing>
           <wp:inline>
-            <wp:extent cx="2688336" cy="1709928"/>
+            <wp:extent cx="2670048" cy="1700784"/>
             <wp:effectExtent b="0" l="0" r="0" t="0"/>
-            <wp:docPr descr="" title="" id="38" name="Picture"/>
+            <wp:docPr descr="" title="" id="27" name="Picture"/>
             <a:graphic>
               <a:graphicData uri="http://schemas.openxmlformats.org/drawingml/2006/picture">
                 <pic:pic>
                   <pic:nvPicPr>
-                    <pic:cNvPr descr="be-less-wrong_files/figure-docx/mermaid-figure-2.png" id="39" name="Picture"/>
+                    <pic:cNvPr descr="be-less-wrong_files/figure-docx/mermaid-figure-2.png" id="28" name="Picture"/>
                     <pic:cNvPicPr>
                       <a:picLocks noChangeArrowheads="1" noChangeAspect="1"/>
                     </pic:cNvPicPr>
                   </pic:nvPicPr>
                   <pic:blipFill>
-                    <a:blip r:embed="rId37"/>
+                    <a:blip r:embed="rId26"/>
                     <a:stretch>
                       <a:fillRect/>
                     </a:stretch>
@@ -676,7 +676,7 @@
                   <pic:spPr bwMode="auto">
                     <a:xfrm>
                       <a:off x="0" y="0"/>
-                      <a:ext cx="2688336" cy="1709928"/>
+                      <a:ext cx="2670048" cy="1700784"/>
                     </a:xfrm>
                     <a:prstGeom prst="rect">
                       <a:avLst/>
@@ -700,7 +700,7 @@
         <w:pStyle w:val="BodyText"/>
       </w:pPr>
     </w:p>
-    <w:bookmarkEnd w:id="40"/>
+    <w:bookmarkEnd w:id="29"/>
     <w:p>
       <w:pPr>
         <w:pStyle w:val="BodyText"/>
@@ -709,7 +709,7 @@
         <w:t xml:space="preserve">Our conclusion seems to have flipped!</w:t>
       </w:r>
     </w:p>
-    <w:bookmarkStart w:id="41" w:name="the-intervention-is-recommended"/>
+    <w:bookmarkStart w:id="30" w:name="the-intervention-is-recommended"/>
     <w:p>
       <w:pPr>
         <w:pStyle w:val="Heading2"/>
@@ -742,8 +742,8 @@
         <w:t xml:space="preserve">recommend using this intervention.</w:t>
       </w:r>
     </w:p>
-    <w:bookmarkEnd w:id="41"/>
-    <w:bookmarkStart w:id="47" w:name="cr-p0-group"/>
+    <w:bookmarkEnd w:id="30"/>
+    <w:bookmarkStart w:id="36" w:name="cr-p0-group"/>
     <w:tbl>
       <w:tblPr>
         <w:tblStyle w:val="Table"/>
@@ -757,30 +757,30 @@
       <w:tr>
         <w:tc>
           <w:tcPr/>
-          <w:bookmarkStart w:id="46" w:name="fig-p0-group"/>
+          <w:bookmarkStart w:id="35" w:name="fig-p0-group"/>
           <w:p>
             <w:pPr>
               <w:pStyle w:val="Compact"/>
               <w:jc w:val="center"/>
             </w:pPr>
-            <w:bookmarkStart w:id="45" w:name="fig-p0-group"/>
+            <w:bookmarkStart w:id="34" w:name="fig-p0-group"/>
             <w:r>
               <w:drawing>
                 <wp:inline>
                   <wp:extent cx="5334000" cy="3200400"/>
                   <wp:effectExtent b="0" l="0" r="0" t="0"/>
-                  <wp:docPr descr="" title="" id="43" name="Picture"/>
+                  <wp:docPr descr="" title="" id="32" name="Picture"/>
                   <a:graphic>
                     <a:graphicData uri="http://schemas.openxmlformats.org/drawingml/2006/picture">
                       <pic:pic>
                         <pic:nvPicPr>
-                          <pic:cNvPr descr="be-less-wrong_files/figure-docx/fig-p0-group-1.png" id="44" name="Picture"/>
+                          <pic:cNvPr descr="be-less-wrong_files/figure-docx/fig-p0-group-1.png" id="33" name="Picture"/>
                           <pic:cNvPicPr>
                             <a:picLocks noChangeArrowheads="1" noChangeAspect="1"/>
                           </pic:cNvPicPr>
                         </pic:nvPicPr>
                         <pic:blipFill>
-                          <a:blip r:embed="rId42"/>
+                          <a:blip r:embed="rId31"/>
                           <a:stretch>
                             <a:fillRect/>
                           </a:stretch>
@@ -806,14 +806,14 @@
                 </wp:inline>
               </w:drawing>
             </w:r>
-            <w:bookmarkEnd w:id="45"/>
+            <w:bookmarkEnd w:id="34"/>
           </w:p>
           <w:p>
             <w:pPr>
               <w:jc w:val="center"/>
             </w:pPr>
             <w:pPr>
-              <w:jc w:val="start"/>
+              <w:jc w:val="left"/>
               <w:spacing w:before="200"/>
               <w:pStyle w:val="ImageCaption"/>
             </w:pPr>
@@ -821,11 +821,11 @@
               <w:t xml:space="preserve">Figure 2</w:t>
             </w:r>
           </w:p>
-          <w:bookmarkEnd w:id="46"/>
+          <w:bookmarkEnd w:id="35"/>
         </w:tc>
       </w:tr>
     </w:tbl>
-    <w:bookmarkEnd w:id="47"/>
+    <w:bookmarkEnd w:id="36"/>
     <w:p>
       <w:pPr>
         <w:pStyle w:val="BodyText"/>
@@ -846,11 +846,11 @@
         <w:rPr>
           <w:rStyle w:val="FootnoteReference"/>
         </w:rPr>
-        <w:footnoteReference w:id="48"/>
-      </w:r>
-    </w:p>
-    <w:bookmarkStart w:id="50" w:name="cr-Simpson"/>
-    <w:bookmarkStart w:id="49" w:name="simpsons-paradox"/>
+        <w:footnoteReference w:id="37"/>
+      </w:r>
+    </w:p>
+    <w:bookmarkStart w:id="39" w:name="cr-Simpson"/>
+    <w:bookmarkStart w:id="38" w:name="simpsons-paradox"/>
     <w:p>
       <w:pPr>
         <w:pStyle w:val="Heading2"/>
@@ -879,8 +879,8 @@
         <w:t xml:space="preserve">can change–sometimes quite dramatically–as we add more and more factors to our model.</w:t>
       </w:r>
     </w:p>
-    <w:bookmarkEnd w:id="49"/>
-    <w:bookmarkEnd w:id="50"/>
+    <w:bookmarkEnd w:id="38"/>
+    <w:bookmarkEnd w:id="39"/>
     <w:p>
       <w:pPr>
         <w:pStyle w:val="BodyText"/>
@@ -905,8 +905,8 @@
         <w:t xml:space="preserve">our conclusions.</w:t>
       </w:r>
     </w:p>
-    <w:bookmarkStart w:id="52" w:name="cr-multivariate"/>
-    <w:bookmarkStart w:id="51" w:name="multivariate-processes"/>
+    <w:bookmarkStart w:id="41" w:name="cr-multivariate"/>
+    <w:bookmarkStart w:id="40" w:name="multivariate-processes"/>
     <w:p>
       <w:pPr>
         <w:pStyle w:val="Heading2"/>
@@ -968,8 +968,8 @@
         <w:t xml:space="preserve">.</w:t>
       </w:r>
     </w:p>
-    <w:bookmarkEnd w:id="51"/>
-    <w:bookmarkEnd w:id="52"/>
+    <w:bookmarkEnd w:id="40"/>
+    <w:bookmarkEnd w:id="41"/>
     <w:p>
       <w:pPr>
         <w:pStyle w:val="BodyText"/>
@@ -986,8 +986,8 @@
         <w:t xml:space="preserve">Failure to include all of the relevant variables in our model–whether that model is visual or statistical–may lead to very wrong conclusions.</w:t>
       </w:r>
     </w:p>
-    <w:bookmarkStart w:id="54" w:name="cr-variables"/>
-    <w:bookmarkStart w:id="53" w:name="a-strategy-for-modeling"/>
+    <w:bookmarkStart w:id="43" w:name="cr-variables"/>
+    <w:bookmarkStart w:id="42" w:name="a-strategy-for-modeling"/>
     <w:p>
       <w:pPr>
         <w:pStyle w:val="Heading2"/>
@@ -1004,8 +1004,8 @@
         <w:t xml:space="preserve">If those variables are observed, and included in our data set, it may be straightforward to build them into our model. If those variables are not observed, and not present in our data set, more complicated modeling strategies may be necessary.</w:t>
       </w:r>
     </w:p>
-    <w:bookmarkEnd w:id="53"/>
-    <w:bookmarkEnd w:id="54"/>
+    <w:bookmarkEnd w:id="42"/>
+    <w:bookmarkEnd w:id="43"/>
     <w:p>
       <w:pPr>
         <w:pStyle w:val="BodyText"/>
@@ -1014,8 +1014,8 @@
         <w:t xml:space="preserve">At first the scenario I’ve just presented seems almost like a trick, or a puzzle, designed to confound us, or to illustrate a convoluted statistical scenario. Yet, upon reflection, the scenario I’ve just presented is surprisingly plausible.</w:t>
       </w:r>
     </w:p>
-    <w:bookmarkStart w:id="61" w:name="cr-thoughtexperiment"/>
-    <w:bookmarkStart w:id="60" w:name="a-thought-experiment"/>
+    <w:bookmarkStart w:id="50" w:name="cr-thoughtexperiment"/>
+    <w:bookmarkStart w:id="49" w:name="a-thought-experiment"/>
     <w:p>
       <w:pPr>
         <w:pStyle w:val="Heading2"/>
@@ -1076,30 +1076,30 @@
       <w:tr>
         <w:tc>
           <w:tcPr/>
-          <w:bookmarkStart w:id="59" w:name="fig-combined"/>
+          <w:bookmarkStart w:id="48" w:name="fig-combined"/>
           <w:p>
             <w:pPr>
               <w:pStyle w:val="Compact"/>
               <w:jc w:val="center"/>
             </w:pPr>
-            <w:bookmarkStart w:id="58" w:name="fig-combined"/>
+            <w:bookmarkStart w:id="47" w:name="fig-combined"/>
             <w:r>
               <w:drawing>
                 <wp:inline>
                   <wp:extent cx="5334000" cy="3200400"/>
                   <wp:effectExtent b="0" l="0" r="0" t="0"/>
-                  <wp:docPr descr="" title="" id="56" name="Picture"/>
+                  <wp:docPr descr="" title="" id="45" name="Picture"/>
                   <a:graphic>
                     <a:graphicData uri="http://schemas.openxmlformats.org/drawingml/2006/picture">
                       <pic:pic>
                         <pic:nvPicPr>
-                          <pic:cNvPr descr="be-less-wrong_files/figure-docx/fig-combined-1.png" id="57" name="Picture"/>
+                          <pic:cNvPr descr="be-less-wrong_files/figure-docx/fig-combined-1.png" id="46" name="Picture"/>
                           <pic:cNvPicPr>
                             <a:picLocks noChangeArrowheads="1" noChangeAspect="1"/>
                           </pic:cNvPicPr>
                         </pic:nvPicPr>
                         <pic:blipFill>
-                          <a:blip r:embed="rId55"/>
+                          <a:blip r:embed="rId44"/>
                           <a:stretch>
                             <a:fillRect/>
                           </a:stretch>
@@ -1125,14 +1125,14 @@
                 </wp:inline>
               </w:drawing>
             </w:r>
-            <w:bookmarkEnd w:id="58"/>
+            <w:bookmarkEnd w:id="47"/>
           </w:p>
           <w:p>
             <w:pPr>
               <w:jc w:val="center"/>
             </w:pPr>
             <w:pPr>
-              <w:jc w:val="start"/>
+              <w:jc w:val="left"/>
               <w:spacing w:before="200"/>
               <w:pStyle w:val="ImageCaption"/>
             </w:pPr>
@@ -1140,12 +1140,12 @@
               <w:t xml:space="preserve">Figure 3</w:t>
             </w:r>
           </w:p>
-          <w:bookmarkEnd w:id="59"/>
+          <w:bookmarkEnd w:id="48"/>
         </w:tc>
       </w:tr>
     </w:tbl>
-    <w:bookmarkEnd w:id="60"/>
-    <w:bookmarkEnd w:id="61"/>
+    <w:bookmarkEnd w:id="49"/>
+    <w:bookmarkEnd w:id="50"/>
     <w:p>
       <w:pPr>
         <w:pStyle w:val="BodyText"/>
@@ -1160,7 +1160,7 @@
         <w:rPr>
           <w:rStyle w:val="FootnoteReference"/>
         </w:rPr>
-        <w:footnoteReference w:id="62"/>
+        <w:footnoteReference w:id="51"/>
       </w:r>
       <m:oMath>
         <m:sSup>
@@ -1186,7 +1186,7 @@
         <w:rPr>
           <w:rStyle w:val="FootnoteReference"/>
         </w:rPr>
-        <w:footnoteReference w:id="63"/>
+        <w:footnoteReference w:id="52"/>
       </w:r>
       <m:oMath>
         <m:sSup>
@@ -1212,7 +1212,7 @@
         <w:rPr>
           <w:rStyle w:val="FootnoteReference"/>
         </w:rPr>
-        <w:footnoteReference w:id="64"/>
+        <w:footnoteReference w:id="53"/>
       </w:r>
     </w:p>
     <w:p>
@@ -1260,8 +1260,8 @@
         <w:t xml:space="preserve">.</w:t>
       </w:r>
     </w:p>
-    <w:bookmarkStart w:id="66" w:name="cr-belesswrong"/>
-    <w:bookmarkStart w:id="65" w:name="be-less-wrong"/>
+    <w:bookmarkStart w:id="55" w:name="cr-belesswrong"/>
+    <w:bookmarkStart w:id="54" w:name="be-less-wrong"/>
     <w:p>
       <w:pPr>
         <w:pStyle w:val="Heading2"/>
@@ -1278,10 +1278,10 @@
         <w:t xml:space="preserve">We need to keep the model as simple as possible so that it remains a useful abstraction, but to make the model complicated enough to reflect the complications of reality.</w:t>
       </w:r>
     </w:p>
-    <w:bookmarkEnd w:id="65"/>
-    <w:bookmarkEnd w:id="66"/>
-    <w:bookmarkStart w:id="91" w:name="refs"/>
-    <w:bookmarkStart w:id="67" w:name="ref-Antweiler2016"/>
+    <w:bookmarkEnd w:id="54"/>
+    <w:bookmarkEnd w:id="55"/>
+    <w:bookmarkStart w:id="80" w:name="refs"/>
+    <w:bookmarkStart w:id="56" w:name="ref-Antweiler2016"/>
     <w:p>
       <w:pPr>
         <w:pStyle w:val="Bibliography"/>
@@ -1303,8 +1303,8 @@
         <w:t xml:space="preserve">. Berghahn.</w:t>
       </w:r>
     </w:p>
-    <w:bookmarkEnd w:id="67"/>
-    <w:bookmarkStart w:id="68" w:name="ref-Box1979"/>
+    <w:bookmarkEnd w:id="56"/>
+    <w:bookmarkStart w:id="57" w:name="ref-Box1979"/>
     <w:p>
       <w:pPr>
         <w:pStyle w:val="Bibliography"/>
@@ -1326,8 +1326,8 @@
         <w:t xml:space="preserve">. Academic Press, Inc. [Harcourt Brace Jovanovich, Publishers], New York-London.</w:t>
       </w:r>
     </w:p>
-    <w:bookmarkEnd w:id="68"/>
-    <w:bookmarkStart w:id="70" w:name="ref-Button2013"/>
+    <w:bookmarkEnd w:id="57"/>
+    <w:bookmarkStart w:id="59" w:name="ref-Button2013"/>
     <w:p>
       <w:pPr>
         <w:pStyle w:val="Bibliography"/>
@@ -1364,7 +1364,7 @@
       <w:r>
         <w:t xml:space="preserve"> </w:t>
       </w:r>
-      <w:hyperlink r:id="rId69">
+      <w:hyperlink r:id="rId58">
         <w:r>
           <w:rPr>
             <w:rStyle w:val="Hyperlink"/>
@@ -1373,8 +1373,8 @@
         </w:r>
       </w:hyperlink>
     </w:p>
-    <w:bookmarkEnd w:id="70"/>
-    <w:bookmarkStart w:id="71" w:name="ref-DiezRoux2003"/>
+    <w:bookmarkEnd w:id="59"/>
+    <w:bookmarkStart w:id="60" w:name="ref-DiezRoux2003"/>
     <w:p>
       <w:pPr>
         <w:pStyle w:val="Bibliography"/>
@@ -1399,8 +1399,8 @@
         <w:t xml:space="preserve">(pp. 93–119). Kluwer Academic Publishers.</w:t>
       </w:r>
     </w:p>
-    <w:bookmarkEnd w:id="71"/>
-    <w:bookmarkStart w:id="73" w:name="ref-Draper2022"/>
+    <w:bookmarkEnd w:id="60"/>
+    <w:bookmarkStart w:id="62" w:name="ref-Draper2022"/>
     <w:p>
       <w:pPr>
         <w:pStyle w:val="Bibliography"/>
@@ -1437,7 +1437,7 @@
       <w:r>
         <w:t xml:space="preserve"> </w:t>
       </w:r>
-      <w:hyperlink r:id="rId72">
+      <w:hyperlink r:id="rId61">
         <w:r>
           <w:rPr>
             <w:rStyle w:val="Hyperlink"/>
@@ -1446,8 +1446,8 @@
         </w:r>
       </w:hyperlink>
     </w:p>
-    <w:bookmarkEnd w:id="73"/>
-    <w:bookmarkStart w:id="75" w:name="ref-Elwert2014"/>
+    <w:bookmarkEnd w:id="62"/>
+    <w:bookmarkStart w:id="64" w:name="ref-Elwert2014"/>
     <w:p>
       <w:pPr>
         <w:pStyle w:val="Bibliography"/>
@@ -1484,7 +1484,7 @@
       <w:r>
         <w:t xml:space="preserve"> </w:t>
       </w:r>
-      <w:hyperlink r:id="rId74">
+      <w:hyperlink r:id="rId63">
         <w:r>
           <w:rPr>
             <w:rStyle w:val="Hyperlink"/>
@@ -1493,8 +1493,8 @@
         </w:r>
       </w:hyperlink>
     </w:p>
-    <w:bookmarkEnd w:id="75"/>
-    <w:bookmarkStart w:id="77" w:name="ref-Gelman2007"/>
+    <w:bookmarkEnd w:id="64"/>
+    <w:bookmarkStart w:id="66" w:name="ref-Gelman2007"/>
     <w:p>
       <w:pPr>
         <w:pStyle w:val="Bibliography"/>
@@ -1540,7 +1540,7 @@
       <w:r>
         <w:t xml:space="preserve"> </w:t>
       </w:r>
-      <w:hyperlink r:id="rId76">
+      <w:hyperlink r:id="rId65">
         <w:r>
           <w:rPr>
             <w:rStyle w:val="Hyperlink"/>
@@ -1549,8 +1549,8 @@
         </w:r>
       </w:hyperlink>
     </w:p>
-    <w:bookmarkEnd w:id="77"/>
-    <w:bookmarkStart w:id="79" w:name="ref-Hand2014"/>
+    <w:bookmarkEnd w:id="66"/>
+    <w:bookmarkStart w:id="68" w:name="ref-Hand2014"/>
     <w:p>
       <w:pPr>
         <w:pStyle w:val="Bibliography"/>
@@ -1596,7 +1596,7 @@
       <w:r>
         <w:t xml:space="preserve"> </w:t>
       </w:r>
-      <w:hyperlink r:id="rId78">
+      <w:hyperlink r:id="rId67">
         <w:r>
           <w:rPr>
             <w:rStyle w:val="Hyperlink"/>
@@ -1605,8 +1605,8 @@
         </w:r>
       </w:hyperlink>
     </w:p>
-    <w:bookmarkEnd w:id="79"/>
-    <w:bookmarkStart w:id="81" w:name="ref-Henrich2010"/>
+    <w:bookmarkEnd w:id="68"/>
+    <w:bookmarkStart w:id="70" w:name="ref-Henrich2010"/>
     <w:p>
       <w:pPr>
         <w:pStyle w:val="Bibliography"/>
@@ -1636,7 +1636,7 @@
       <w:r>
         <w:t xml:space="preserve"> </w:t>
       </w:r>
-      <w:hyperlink r:id="rId80">
+      <w:hyperlink r:id="rId69">
         <w:r>
           <w:rPr>
             <w:rStyle w:val="Hyperlink"/>
@@ -1645,8 +1645,8 @@
         </w:r>
       </w:hyperlink>
     </w:p>
-    <w:bookmarkEnd w:id="81"/>
-    <w:bookmarkStart w:id="82" w:name="ref-MR0554183"/>
+    <w:bookmarkEnd w:id="70"/>
+    <w:bookmarkStart w:id="71" w:name="ref-MR0554183"/>
     <w:p>
       <w:pPr>
         <w:pStyle w:val="Bibliography"/>
@@ -1874,8 +1874,8 @@
         <w:t xml:space="preserve">(p. xvi+296). Academic Press, Inc. [Harcourt Brace Jovanovich, Publishers], New York-London.</w:t>
       </w:r>
     </w:p>
-    <w:bookmarkEnd w:id="82"/>
-    <w:bookmarkStart w:id="83" w:name="ref-Martin-Baro1994B"/>
+    <w:bookmarkEnd w:id="71"/>
+    <w:bookmarkStart w:id="72" w:name="ref-Martin-Baro1994B"/>
     <w:p>
       <w:pPr>
         <w:pStyle w:val="Bibliography"/>
@@ -1897,8 +1897,8 @@
         <w:t xml:space="preserve">. Harvard University Press.</w:t>
       </w:r>
     </w:p>
-    <w:bookmarkEnd w:id="83"/>
-    <w:bookmarkStart w:id="85" w:name="ref-Nieuwenhuis2015"/>
+    <w:bookmarkEnd w:id="72"/>
+    <w:bookmarkStart w:id="74" w:name="ref-Nieuwenhuis2015"/>
     <w:p>
       <w:pPr>
         <w:pStyle w:val="Bibliography"/>
@@ -1935,7 +1935,7 @@
       <w:r>
         <w:t xml:space="preserve"> </w:t>
       </w:r>
-      <w:hyperlink r:id="rId84">
+      <w:hyperlink r:id="rId73">
         <w:r>
           <w:rPr>
             <w:rStyle w:val="Hyperlink"/>
@@ -1944,8 +1944,8 @@
         </w:r>
       </w:hyperlink>
     </w:p>
-    <w:bookmarkEnd w:id="85"/>
-    <w:bookmarkStart w:id="86" w:name="ref-Silverman1998"/>
+    <w:bookmarkEnd w:id="74"/>
+    <w:bookmarkStart w:id="75" w:name="ref-Silverman1998"/>
     <w:p>
       <w:pPr>
         <w:pStyle w:val="Bibliography"/>
@@ -1967,8 +1967,8 @@
         <w:t xml:space="preserve">. Oxford University Press.</w:t>
       </w:r>
     </w:p>
-    <w:bookmarkEnd w:id="86"/>
-    <w:bookmarkStart w:id="88" w:name="ref-Simpson1951"/>
+    <w:bookmarkEnd w:id="75"/>
+    <w:bookmarkStart w:id="77" w:name="ref-Simpson1951"/>
     <w:p>
       <w:pPr>
         <w:pStyle w:val="Bibliography"/>
@@ -2005,7 +2005,7 @@
       <w:r>
         <w:t xml:space="preserve"> </w:t>
       </w:r>
-      <w:hyperlink r:id="rId87">
+      <w:hyperlink r:id="rId76">
         <w:r>
           <w:rPr>
             <w:rStyle w:val="Hyperlink"/>
@@ -2014,8 +2014,8 @@
         </w:r>
       </w:hyperlink>
     </w:p>
-    <w:bookmarkEnd w:id="88"/>
-    <w:bookmarkStart w:id="90" w:name="ref-Westreich2013"/>
+    <w:bookmarkEnd w:id="77"/>
+    <w:bookmarkStart w:id="79" w:name="ref-Westreich2013"/>
     <w:p>
       <w:pPr>
         <w:pStyle w:val="Bibliography"/>
@@ -2052,7 +2052,7 @@
       <w:r>
         <w:t xml:space="preserve"> </w:t>
       </w:r>
-      <w:hyperlink r:id="rId89">
+      <w:hyperlink r:id="rId78">
         <w:r>
           <w:rPr>
             <w:rStyle w:val="Hyperlink"/>
@@ -2061,8 +2061,8 @@
         </w:r>
       </w:hyperlink>
     </w:p>
-    <w:bookmarkEnd w:id="90"/>
-    <w:bookmarkEnd w:id="91"/>
+    <w:bookmarkEnd w:id="79"/>
+    <w:bookmarkEnd w:id="80"/>
     <w:sectPr>
       <w:footnotePr>
         <w:numRestart w:val="eachSect"/>
@@ -2092,7 +2092,7 @@
       </w:r>
     </w:p>
   </w:footnote>
-  <w:footnote w:id="48">
+  <w:footnote w:id="37">
     <w:p>
       <w:pPr>
         <w:pStyle w:val="FootnoteText"/>
@@ -2136,7 +2136,7 @@
       </w:r>
     </w:p>
   </w:footnote>
-  <w:footnote w:id="62">
+  <w:footnote w:id="51">
     <w:p>
       <w:pPr>
         <w:pStyle w:val="FootnoteText"/>
@@ -2184,7 +2184,7 @@
       </w:r>
     </w:p>
   </w:footnote>
-  <w:footnote w:id="63">
+  <w:footnote w:id="52">
     <w:p>
       <w:pPr>
         <w:pStyle w:val="FootnoteText"/>
@@ -2633,7 +2633,7 @@
       </w:r>
     </w:p>
   </w:footnote>
-  <w:footnote w:id="64">
+  <w:footnote w:id="53">
     <w:p>
       <w:pPr>
         <w:pStyle w:val="FootnoteText"/>
@@ -2837,7 +2837,39 @@
         <w:t xml:space="preserve">(Antweiler, 2016; Draper et al., 2022; Henrich et al., 2010)</w:t>
       </w:r>
       <w:r>
-        <w:t xml:space="preserve">. Lastly, also not often enough acknowledged, is that the smaller samples often used in RCT’s are more likely to generate</w:t>
+        <w:t xml:space="preserve">. Third, the logistical demands of RCT’s may lead to studies with</w:t>
+      </w:r>
+      <w:r>
+        <w:t xml:space="preserve"> </w:t>
+      </w:r>
+      <w:r>
+        <w:rPr>
+          <w:i/>
+          <w:iCs/>
+        </w:rPr>
+        <w:t xml:space="preserve">shorter time frames</w:t>
+      </w:r>
+      <w:r>
+        <w:t xml:space="preserve"> </w:t>
+      </w:r>
+      <w:r>
+        <w:t xml:space="preserve">(several months or a year) when many phenomena would be better observed over a</w:t>
+      </w:r>
+      <w:r>
+        <w:t xml:space="preserve"> </w:t>
+      </w:r>
+      <w:r>
+        <w:rPr>
+          <w:i/>
+          <w:iCs/>
+        </w:rPr>
+        <w:t xml:space="preserve">longer time frame</w:t>
+      </w:r>
+      <w:r>
+        <w:t xml:space="preserve"> </w:t>
+      </w:r>
+      <w:r>
+        <w:t xml:space="preserve">of several years, or even many years. Lastly, also not often enough acknowledged, is that the smaller samples often used in RCT’s are more likely to generate</w:t>
       </w:r>
       <w:r>
         <w:t xml:space="preserve"> </w:t>
@@ -2958,10 +2990,10 @@
   <w:docDefaults>
     <w:rPrDefault>
       <w:rPr>
-        <w:rFonts w:asciiTheme="minorHAnsi" w:cstheme="minorBidi" w:eastAsiaTheme="minorHAnsi" w:hAnsiTheme="minorHAnsi"/>
+        <w:rFonts w:asciiTheme="minorHAnsi" w:cstheme="minorBidi" w:eastAsiaTheme="minorEastAsia" w:hAnsiTheme="minorHAnsi"/>
         <w:sz w:val="24"/>
         <w:szCs w:val="24"/>
-        <w:lang w:bidi="ar-SA" w:eastAsia="en-US" w:val="en-US"/>
+        <w:lang w:bidi="ar-SA" w:eastAsia="zh-CN" w:val="en-US"/>
       </w:rPr>
     </w:rPrDefault>
     <w:pPrDefault>
@@ -3502,13 +3534,6 @@
       </w:tblCellMar>
     </w:tblPr>
     <w:tblStylePr w:type="firstRow">
-      <w:tblPr>
-        <w:jc w:val="left"/>
-        <w:tblInd w:type="dxa" w:w="0"/>
-      </w:tblPr>
-      <w:trPr>
-        <w:jc w:val="left"/>
-      </w:trPr>
       <w:tcPr>
         <w:tcBorders>
           <w:bottom w:val="single"/>

</xml_diff>

<commit_message>
tried thicker linkStyle in diagrams; doesn't work with handDrawn look; went back to defaults
</commit_message>
<xml_diff>
--- a/be-less-wrong/be-less-wrong.docx
+++ b/be-less-wrong/be-less-wrong.docx
@@ -31,7 +31,7 @@
         <w:pStyle w:val="Date"/>
       </w:pPr>
       <w:r>
-        <w:t xml:space="preserve">2026-03-26</w:t>
+        <w:t xml:space="preserve">2026-04-04</w:t>
       </w:r>
     </w:p>
     <w:p>
@@ -351,7 +351,7 @@
       <w:r>
         <w:drawing>
           <wp:inline>
-            <wp:extent cx="2670048" cy="694944"/>
+            <wp:extent cx="2651760" cy="694944"/>
             <wp:effectExtent b="0" l="0" r="0" t="0"/>
             <wp:docPr descr="" title="" id="15" name="Picture"/>
             <a:graphic>
@@ -372,7 +372,7 @@
                   <pic:spPr bwMode="auto">
                     <a:xfrm>
                       <a:off x="0" y="0"/>
-                      <a:ext cx="2670048" cy="694944"/>
+                      <a:ext cx="2651760" cy="694944"/>
                     </a:xfrm>
                     <a:prstGeom prst="rect">
                       <a:avLst/>
@@ -669,7 +669,7 @@
       <w:r>
         <w:drawing>
           <wp:inline>
-            <wp:extent cx="2660904" cy="1700784"/>
+            <wp:extent cx="2670048" cy="1700784"/>
             <wp:effectExtent b="0" l="0" r="0" t="0"/>
             <wp:docPr descr="" title="" id="27" name="Picture"/>
             <a:graphic>
@@ -690,7 +690,7 @@
                   <pic:spPr bwMode="auto">
                     <a:xfrm>
                       <a:off x="0" y="0"/>
-                      <a:ext cx="2660904" cy="1700784"/>
+                      <a:ext cx="2670048" cy="1700784"/>
                     </a:xfrm>
                     <a:prstGeom prst="rect">
                       <a:avLst/>

</xml_diff>

<commit_message>
added cites about Simpson's paradox; sorted bibliography and fixed accents in bibliography
</commit_message>
<xml_diff>
--- a/be-less-wrong/be-less-wrong.docx
+++ b/be-less-wrong/be-less-wrong.docx
@@ -31,7 +31,7 @@
         <w:pStyle w:val="Date"/>
       </w:pPr>
       <w:r>
-        <w:t xml:space="preserve">2026-04-04</w:t>
+        <w:t xml:space="preserve">2026-04-09</w:t>
       </w:r>
     </w:p>
     <w:p>
@@ -351,7 +351,7 @@
       <w:r>
         <w:drawing>
           <wp:inline>
-            <wp:extent cx="2651760" cy="694944"/>
+            <wp:extent cx="2679192" cy="685800"/>
             <wp:effectExtent b="0" l="0" r="0" t="0"/>
             <wp:docPr descr="" title="" id="15" name="Picture"/>
             <a:graphic>
@@ -372,7 +372,7 @@
                   <pic:spPr bwMode="auto">
                     <a:xfrm>
                       <a:off x="0" y="0"/>
-                      <a:ext cx="2651760" cy="694944"/>
+                      <a:ext cx="2679192" cy="685800"/>
                     </a:xfrm>
                     <a:prstGeom prst="rect">
                       <a:avLst/>
@@ -669,7 +669,7 @@
       <w:r>
         <w:drawing>
           <wp:inline>
-            <wp:extent cx="2670048" cy="1700784"/>
+            <wp:extent cx="2670048" cy="1709928"/>
             <wp:effectExtent b="0" l="0" r="0" t="0"/>
             <wp:docPr descr="" title="" id="27" name="Picture"/>
             <a:graphic>
@@ -690,7 +690,7 @@
                   <pic:spPr bwMode="auto">
                     <a:xfrm>
                       <a:off x="0" y="0"/>
-                      <a:ext cx="2670048" cy="1700784"/>
+                      <a:ext cx="2670048" cy="1709928"/>
                     </a:xfrm>
                     <a:prstGeom prst="rect">
                       <a:avLst/>
@@ -890,7 +890,16 @@
         <w:t xml:space="preserve"> </w:t>
       </w:r>
       <w:r>
-        <w:t xml:space="preserve">can change–sometimes quite dramatically–as we add more and more factors to our model.</w:t>
+        <w:t xml:space="preserve">can change–sometimes quite dramatically–as we add more and more factors to our model</w:t>
+      </w:r>
+      <w:r>
+        <w:t xml:space="preserve"> </w:t>
+      </w:r>
+      <w:r>
+        <w:t xml:space="preserve">(Marang-van de Mheen &amp; Shojania, 2014; Norton &amp; Divine, 2015)</w:t>
+      </w:r>
+      <w:r>
+        <w:t xml:space="preserve">.</w:t>
       </w:r>
     </w:p>
     <w:bookmarkEnd w:id="38"/>
@@ -1294,7 +1303,7 @@
     </w:p>
     <w:bookmarkEnd w:id="54"/>
     <w:bookmarkEnd w:id="55"/>
-    <w:bookmarkStart w:id="80" w:name="refs"/>
+    <w:bookmarkStart w:id="84" w:name="refs"/>
     <w:bookmarkStart w:id="56" w:name="ref-Antweiler2016"/>
     <w:p>
       <w:pPr>
@@ -1347,7 +1356,7 @@
         <w:pStyle w:val="Bibliography"/>
       </w:pPr>
       <w:r>
-        <w:t xml:space="preserve">Button, K. S., Ioannidis, J. P. A., Mokrysz, C., Nosek, B. A., Flint, J., Robinson, E. S. J., &amp; Munafò, M. R. (2013). Power failure: Why small sample size undermines the reliability of neuroscience.</w:t>
+        <w:t xml:space="preserve">Button, K. S., Ioannidis, J. P. A., Mokrysz, C., Nosek, B. A., Flint, J., Robinson, E. S. J., &amp; Munaf‘o, M. R. (2013). Power failure: Why small sample size undermines the reliability of neuroscience.</w:t>
       </w:r>
       <w:r>
         <w:t xml:space="preserve"> </w:t>
@@ -1889,12 +1898,87 @@
       </w:r>
     </w:p>
     <w:bookmarkEnd w:id="71"/>
-    <w:bookmarkStart w:id="72" w:name="ref-Martin-Baro1994B"/>
+    <w:bookmarkStart w:id="73" w:name="ref-Marang-vandeMheen2014"/>
     <w:p>
       <w:pPr>
         <w:pStyle w:val="Bibliography"/>
       </w:pPr>
       <w:r>
+        <w:t xml:space="preserve">Marang-van de Mheen, P. J., &amp; Shojania, K. G. (2014). Simpson’s paradox: How performance measurement can fail even with perfect risk adjustment.</w:t>
+      </w:r>
+      <w:r>
+        <w:t xml:space="preserve"> </w:t>
+      </w:r>
+      <w:r>
+        <w:rPr>
+          <w:i/>
+          <w:iCs/>
+        </w:rPr>
+        <w:t xml:space="preserve">BMJ Quality</w:t>
+      </w:r>
+      <w:r>
+        <w:rPr>
+          <w:i/>
+          <w:iCs/>
+        </w:rPr>
+        <w:t xml:space="preserve"> </w:t>
+      </w:r>
+      <w:r>
+        <w:rPr>
+          <w:i/>
+          <w:iCs/>
+        </w:rPr>
+        <w:t xml:space="preserve">&amp;</w:t>
+      </w:r>
+      <w:r>
+        <w:rPr>
+          <w:i/>
+          <w:iCs/>
+        </w:rPr>
+        <w:t xml:space="preserve"> </w:t>
+      </w:r>
+      <w:r>
+        <w:rPr>
+          <w:i/>
+          <w:iCs/>
+        </w:rPr>
+        <w:t xml:space="preserve">Safety</w:t>
+      </w:r>
+      <w:r>
+        <w:t xml:space="preserve">,</w:t>
+      </w:r>
+      <w:r>
+        <w:t xml:space="preserve"> </w:t>
+      </w:r>
+      <w:r>
+        <w:rPr>
+          <w:i/>
+          <w:iCs/>
+        </w:rPr>
+        <w:t xml:space="preserve">23</w:t>
+      </w:r>
+      <w:r>
+        <w:t xml:space="preserve">, 701.</w:t>
+      </w:r>
+      <w:r>
+        <w:t xml:space="preserve"> </w:t>
+      </w:r>
+      <w:hyperlink r:id="rId72">
+        <w:r>
+          <w:rPr>
+            <w:rStyle w:val="Hyperlink"/>
+          </w:rPr>
+          <w:t xml:space="preserve">https://doi.org/10.1136/bmjqs-2014-003358</w:t>
+        </w:r>
+      </w:hyperlink>
+    </w:p>
+    <w:bookmarkEnd w:id="73"/>
+    <w:bookmarkStart w:id="74" w:name="ref-Martin-Baro1994B"/>
+    <w:p>
+      <w:pPr>
+        <w:pStyle w:val="Bibliography"/>
+      </w:pPr>
+      <w:r>
         <w:t xml:space="preserve">Martín-Baró, I. (1994). Toward a liberation psychology. In A. Aron &amp; S. Corne (Eds.),</w:t>
       </w:r>
       <w:r>
@@ -1911,8 +1995,8 @@
         <w:t xml:space="preserve">. Harvard University Press.</w:t>
       </w:r>
     </w:p>
-    <w:bookmarkEnd w:id="72"/>
-    <w:bookmarkStart w:id="74" w:name="ref-Nieuwenhuis2015"/>
+    <w:bookmarkEnd w:id="74"/>
+    <w:bookmarkStart w:id="76" w:name="ref-Nieuwenhuis2015"/>
     <w:p>
       <w:pPr>
         <w:pStyle w:val="Bibliography"/>
@@ -1949,7 +2033,7 @@
       <w:r>
         <w:t xml:space="preserve"> </w:t>
       </w:r>
-      <w:hyperlink r:id="rId73">
+      <w:hyperlink r:id="rId75">
         <w:r>
           <w:rPr>
             <w:rStyle w:val="Hyperlink"/>
@@ -1958,13 +2042,60 @@
         </w:r>
       </w:hyperlink>
     </w:p>
-    <w:bookmarkEnd w:id="74"/>
-    <w:bookmarkStart w:id="75" w:name="ref-Silverman1998"/>
+    <w:bookmarkEnd w:id="76"/>
+    <w:bookmarkStart w:id="78" w:name="ref-Norton2015"/>
     <w:p>
       <w:pPr>
         <w:pStyle w:val="Bibliography"/>
       </w:pPr>
       <w:r>
+        <w:t xml:space="preserve">Norton, H. J., &amp; Divine, G. (2015). Simpson’s paradox … and how to avoid it.</w:t>
+      </w:r>
+      <w:r>
+        <w:t xml:space="preserve"> </w:t>
+      </w:r>
+      <w:r>
+        <w:rPr>
+          <w:i/>
+          <w:iCs/>
+        </w:rPr>
+        <w:t xml:space="preserve">Significance</w:t>
+      </w:r>
+      <w:r>
+        <w:t xml:space="preserve">,</w:t>
+      </w:r>
+      <w:r>
+        <w:t xml:space="preserve"> </w:t>
+      </w:r>
+      <w:r>
+        <w:rPr>
+          <w:i/>
+          <w:iCs/>
+        </w:rPr>
+        <w:t xml:space="preserve">12</w:t>
+      </w:r>
+      <w:r>
+        <w:t xml:space="preserve">, 40–43.</w:t>
+      </w:r>
+      <w:r>
+        <w:t xml:space="preserve"> </w:t>
+      </w:r>
+      <w:hyperlink r:id="rId77">
+        <w:r>
+          <w:rPr>
+            <w:rStyle w:val="Hyperlink"/>
+          </w:rPr>
+          <w:t xml:space="preserve">https://doi.org/10.1111/j.1740-9713.2015.00844.x</w:t>
+        </w:r>
+      </w:hyperlink>
+    </w:p>
+    <w:bookmarkEnd w:id="78"/>
+    <w:bookmarkStart w:id="79" w:name="ref-Silverman1998"/>
+    <w:p>
+      <w:pPr>
+        <w:pStyle w:val="Bibliography"/>
+      </w:pPr>
+      <w:r>
         <w:t xml:space="preserve">Silverman, W. A. (1998). Non-replication of the replicable (1996). In</w:t>
       </w:r>
       <w:r>
@@ -1981,8 +2112,8 @@
         <w:t xml:space="preserve">. Oxford University Press.</w:t>
       </w:r>
     </w:p>
-    <w:bookmarkEnd w:id="75"/>
-    <w:bookmarkStart w:id="77" w:name="ref-Simpson1951"/>
+    <w:bookmarkEnd w:id="79"/>
+    <w:bookmarkStart w:id="81" w:name="ref-Simpson1951"/>
     <w:p>
       <w:pPr>
         <w:pStyle w:val="Bibliography"/>
@@ -2019,7 +2150,7 @@
       <w:r>
         <w:t xml:space="preserve"> </w:t>
       </w:r>
-      <w:hyperlink r:id="rId76">
+      <w:hyperlink r:id="rId80">
         <w:r>
           <w:rPr>
             <w:rStyle w:val="Hyperlink"/>
@@ -2028,8 +2159,8 @@
         </w:r>
       </w:hyperlink>
     </w:p>
-    <w:bookmarkEnd w:id="77"/>
-    <w:bookmarkStart w:id="79" w:name="ref-Westreich2013"/>
+    <w:bookmarkEnd w:id="81"/>
+    <w:bookmarkStart w:id="83" w:name="ref-Westreich2013"/>
     <w:p>
       <w:pPr>
         <w:pStyle w:val="Bibliography"/>
@@ -2066,7 +2197,7 @@
       <w:r>
         <w:t xml:space="preserve"> </w:t>
       </w:r>
-      <w:hyperlink r:id="rId78">
+      <w:hyperlink r:id="rId82">
         <w:r>
           <w:rPr>
             <w:rStyle w:val="Hyperlink"/>
@@ -2075,8 +2206,8 @@
         </w:r>
       </w:hyperlink>
     </w:p>
-    <w:bookmarkEnd w:id="79"/>
-    <w:bookmarkEnd w:id="80"/>
+    <w:bookmarkEnd w:id="83"/>
+    <w:bookmarkEnd w:id="84"/>
     <w:sectPr>
       <w:footnotePr>
         <w:numRestart w:val="eachSect"/>

</xml_diff>

<commit_message>
moved citations to left hand side
</commit_message>
<xml_diff>
--- a/be-less-wrong/be-less-wrong.docx
+++ b/be-less-wrong/be-less-wrong.docx
@@ -31,7 +31,7 @@
         <w:pStyle w:val="Date"/>
       </w:pPr>
       <w:r>
-        <w:t xml:space="preserve">2026-04-09</w:t>
+        <w:t xml:space="preserve">2026-04-15</w:t>
       </w:r>
     </w:p>
     <w:p>
@@ -351,7 +351,7 @@
       <w:r>
         <w:drawing>
           <wp:inline>
-            <wp:extent cx="2679192" cy="685800"/>
+            <wp:extent cx="2670048" cy="694944"/>
             <wp:effectExtent b="0" l="0" r="0" t="0"/>
             <wp:docPr descr="" title="" id="15" name="Picture"/>
             <a:graphic>
@@ -372,7 +372,7 @@
                   <pic:spPr bwMode="auto">
                     <a:xfrm>
                       <a:off x="0" y="0"/>
-                      <a:ext cx="2679192" cy="685800"/>
+                      <a:ext cx="2670048" cy="694944"/>
                     </a:xfrm>
                     <a:prstGeom prst="rect">
                       <a:avLst/>
@@ -669,7 +669,7 @@
       <w:r>
         <w:drawing>
           <wp:inline>
-            <wp:extent cx="2670048" cy="1709928"/>
+            <wp:extent cx="2660904" cy="1709928"/>
             <wp:effectExtent b="0" l="0" r="0" t="0"/>
             <wp:docPr descr="" title="" id="27" name="Picture"/>
             <a:graphic>
@@ -690,7 +690,7 @@
                   <pic:spPr bwMode="auto">
                     <a:xfrm>
                       <a:off x="0" y="0"/>
-                      <a:ext cx="2670048" cy="1709928"/>
+                      <a:ext cx="2660904" cy="1709928"/>
                     </a:xfrm>
                     <a:prstGeom prst="rect">
                       <a:avLst/>
@@ -851,7 +851,7 @@
         <w:t xml:space="preserve"> </w:t>
       </w:r>
       <w:r>
-        <w:t xml:space="preserve">(Simpson, 1951)</w:t>
+        <w:t xml:space="preserve">(Marang-van de Mheen &amp; Shojania, 2014; Norton &amp; Divine, 2015; Simpson, 1951)</w:t>
       </w:r>
       <w:r>
         <w:t xml:space="preserve">.</w:t>
@@ -890,16 +890,7 @@
         <w:t xml:space="preserve"> </w:t>
       </w:r>
       <w:r>
-        <w:t xml:space="preserve">can change–sometimes quite dramatically–as we add more and more factors to our model</w:t>
-      </w:r>
-      <w:r>
-        <w:t xml:space="preserve"> </w:t>
-      </w:r>
-      <w:r>
-        <w:t xml:space="preserve">(Marang-van de Mheen &amp; Shojania, 2014; Norton &amp; Divine, 2015)</w:t>
-      </w:r>
-      <w:r>
-        <w:t xml:space="preserve">.</w:t>
+        <w:t xml:space="preserve">can change–sometimes quite dramatically–as we add more and more factors to our model.</w:t>
       </w:r>
     </w:p>
     <w:bookmarkEnd w:id="38"/>

</xml_diff>

<commit_message>
Correct typos in "Munafo"
</commit_message>
<xml_diff>
--- a/be-less-wrong/be-less-wrong.docx
+++ b/be-less-wrong/be-less-wrong.docx
@@ -31,7 +31,7 @@
         <w:pStyle w:val="Date"/>
       </w:pPr>
       <w:r>
-        <w:t xml:space="preserve">2026-04-15</w:t>
+        <w:t xml:space="preserve">2026-04-29</w:t>
       </w:r>
     </w:p>
     <w:p>
@@ -48,7 +48,7 @@
         <w:t xml:space="preserve">⬇️</w:t>
       </w:r>
     </w:p>
-    <w:bookmarkStart w:id="9" w:name="cr-martinbaro"/>
+    <w:bookmarkStart w:id="20" w:name="cr-martinbaro"/>
     <w:p>
       <w:pPr>
         <w:pStyle w:val="BlockText"/>
@@ -63,7 +63,7 @@
         <w:t xml:space="preserve">(Martín-Baró, 1994)</w:t>
       </w:r>
     </w:p>
-    <w:bookmarkEnd w:id="9"/>
+    <w:bookmarkEnd w:id="20"/>
     <w:p>
       <w:pPr>
         <w:pStyle w:val="FirstParagraph"/>
@@ -88,8 +88,8 @@
         <w:t xml:space="preserve">of abuse, neglect, suffering, exploitation, violence, discrimination, and other associated problems that we are trying to understand, and to reduce.</w:t>
       </w:r>
     </w:p>
-    <w:bookmarkStart w:id="10" w:name="cr-earth"/>
-    <w:bookmarkEnd w:id="10"/>
+    <w:bookmarkStart w:id="21" w:name="cr-earth"/>
+    <w:bookmarkEnd w:id="21"/>
     <w:p>
       <w:pPr>
         <w:pStyle w:val="BodyText"/>
@@ -176,7 +176,7 @@
         <w:t xml:space="preserve">wrote:</w:t>
       </w:r>
     </w:p>
-    <w:bookmarkStart w:id="11" w:name="cr-silverman"/>
+    <w:bookmarkStart w:id="22" w:name="cr-silverman"/>
     <w:p>
       <w:pPr>
         <w:pStyle w:val="BlockText"/>
@@ -203,7 +203,7 @@
         <w:t xml:space="preserve">(Silverman, 1998)</w:t>
       </w:r>
     </w:p>
-    <w:bookmarkEnd w:id="11"/>
+    <w:bookmarkEnd w:id="22"/>
     <w:p>
       <w:pPr>
         <w:pStyle w:val="FirstParagraph"/>
@@ -221,7 +221,7 @@
         <w:t xml:space="preserve">:</w:t>
       </w:r>
     </w:p>
-    <w:bookmarkStart w:id="12" w:name="cr-box"/>
+    <w:bookmarkStart w:id="23" w:name="cr-box"/>
     <w:p>
       <w:pPr>
         <w:pStyle w:val="BlockText"/>
@@ -257,7 +257,7 @@
         <w:t xml:space="preserve">(Hand, 2014)</w:t>
       </w:r>
     </w:p>
-    <w:bookmarkEnd w:id="12"/>
+    <w:bookmarkEnd w:id="23"/>
     <w:p>
       <w:pPr>
         <w:pStyle w:val="FirstParagraph"/>
@@ -282,7 +282,7 @@
         <w:t xml:space="preserve">in the discoveries we are making about social issues.</w:t>
       </w:r>
     </w:p>
-    <w:bookmarkStart w:id="13" w:name="cr-box2"/>
+    <w:bookmarkStart w:id="24" w:name="cr-box2"/>
     <w:p>
       <w:pPr>
         <w:pStyle w:val="BlockText"/>
@@ -297,7 +297,7 @@
         <w:t xml:space="preserve">(Box, 1979)</w:t>
       </w:r>
     </w:p>
-    <w:bookmarkEnd w:id="13"/>
+    <w:bookmarkEnd w:id="24"/>
     <w:p>
       <w:pPr>
         <w:pStyle w:val="FirstParagraph"/>
@@ -338,7 +338,7 @@
         <w:t xml:space="preserve">(an improved or beneficial mental health or psychological outcome).</w:t>
       </w:r>
     </w:p>
-    <w:bookmarkStart w:id="17" w:name="cr-flowchart"/>
+    <w:bookmarkStart w:id="28" w:name="cr-flowchart"/>
     <w:p>
       <w:pPr>
         <w:pStyle w:val="BodyText"/>
@@ -353,18 +353,18 @@
           <wp:inline>
             <wp:extent cx="2670048" cy="694944"/>
             <wp:effectExtent b="0" l="0" r="0" t="0"/>
-            <wp:docPr descr="" title="" id="15" name="Picture"/>
+            <wp:docPr descr="" title="" id="26" name="Picture"/>
             <a:graphic>
               <a:graphicData uri="http://schemas.openxmlformats.org/drawingml/2006/picture">
                 <pic:pic>
                   <pic:nvPicPr>
-                    <pic:cNvPr descr="be-less-wrong_files/figure-docx/mermaid-figure-1.png" id="16" name="Picture"/>
+                    <pic:cNvPr descr="be-less-wrong_files\figure-docx\mermaid-figure-1.png" id="27" name="Picture"/>
                     <pic:cNvPicPr>
                       <a:picLocks noChangeArrowheads="1" noChangeAspect="1"/>
                     </pic:cNvPicPr>
                   </pic:nvPicPr>
                   <pic:blipFill>
-                    <a:blip r:embed="rId14"/>
+                    <a:blip r:embed="rId25"/>
                     <a:stretch>
                       <a:fillRect/>
                     </a:stretch>
@@ -396,7 +396,7 @@
         <w:pStyle w:val="BodyText"/>
       </w:pPr>
     </w:p>
-    <w:bookmarkEnd w:id="17"/>
+    <w:bookmarkEnd w:id="28"/>
     <w:p>
       <w:pPr>
         <w:pStyle w:val="BodyText"/>
@@ -434,7 +434,7 @@
         <w:t xml:space="preserve">?</w:t>
       </w:r>
     </w:p>
-    <w:bookmarkStart w:id="23" w:name="cr-p0"/>
+    <w:bookmarkStart w:id="34" w:name="cr-p0"/>
     <w:tbl>
       <w:tblPr>
         <w:tblStyle w:val="Table"/>
@@ -448,30 +448,30 @@
       <w:tr>
         <w:tc>
           <w:tcPr/>
-          <w:bookmarkStart w:id="22" w:name="fig-p0"/>
+          <w:bookmarkStart w:id="33" w:name="fig-p0"/>
           <w:p>
             <w:pPr>
               <w:pStyle w:val="Compact"/>
               <w:jc w:val="center"/>
             </w:pPr>
-            <w:bookmarkStart w:id="21" w:name="fig-p0"/>
+            <w:bookmarkStart w:id="32" w:name="fig-p0"/>
             <w:r>
               <w:drawing>
                 <wp:inline>
-                  <wp:extent cx="5334000" cy="3200400"/>
+                  <wp:extent cx="4620126" cy="2772075"/>
                   <wp:effectExtent b="0" l="0" r="0" t="0"/>
-                  <wp:docPr descr="" title="" id="19" name="Picture"/>
+                  <wp:docPr descr="" title="" id="30" name="Picture"/>
                   <a:graphic>
                     <a:graphicData uri="http://schemas.openxmlformats.org/drawingml/2006/picture">
                       <pic:pic>
                         <pic:nvPicPr>
-                          <pic:cNvPr descr="be-less-wrong_files/figure-docx/fig-p0-1.png" id="20" name="Picture"/>
+                          <pic:cNvPr descr="be-less-wrong_files/figure-docx/fig-p0-1.png" id="31" name="Picture"/>
                           <pic:cNvPicPr>
                             <a:picLocks noChangeArrowheads="1" noChangeAspect="1"/>
                           </pic:cNvPicPr>
                         </pic:nvPicPr>
                         <pic:blipFill>
-                          <a:blip r:embed="rId18"/>
+                          <a:blip r:embed="rId29"/>
                           <a:stretch>
                             <a:fillRect/>
                           </a:stretch>
@@ -479,7 +479,7 @@
                         <pic:spPr bwMode="auto">
                           <a:xfrm>
                             <a:off x="0" y="0"/>
-                            <a:ext cx="5334000" cy="3200400"/>
+                            <a:ext cx="4620126" cy="2772075"/>
                           </a:xfrm>
                           <a:prstGeom prst="rect">
                             <a:avLst/>
@@ -497,14 +497,14 @@
                 </wp:inline>
               </w:drawing>
             </w:r>
-            <w:bookmarkEnd w:id="21"/>
+            <w:bookmarkEnd w:id="32"/>
           </w:p>
           <w:p>
             <w:pPr>
               <w:jc w:val="center"/>
             </w:pPr>
             <w:pPr>
-              <w:jc w:val="left"/>
+              <w:jc w:val="start"/>
               <w:spacing w:before="200"/>
               <w:pStyle w:val="ImageCaption"/>
             </w:pPr>
@@ -512,11 +512,11 @@
               <w:t xml:space="preserve">Figure 1</w:t>
             </w:r>
           </w:p>
-          <w:bookmarkEnd w:id="22"/>
+          <w:bookmarkEnd w:id="33"/>
         </w:tc>
       </w:tr>
     </w:tbl>
-    <w:bookmarkEnd w:id="23"/>
+    <w:bookmarkEnd w:id="34"/>
     <w:p>
       <w:pPr>
         <w:pStyle w:val="BodyText"/>
@@ -554,8 +554,8 @@
         <w:t xml:space="preserve">.</w:t>
       </w:r>
     </w:p>
-    <w:bookmarkStart w:id="25" w:name="cr-notrecommended"/>
-    <w:bookmarkStart w:id="24" w:name="the-intervention-is-not-recommended"/>
+    <w:bookmarkStart w:id="36" w:name="cr-notrecommended"/>
+    <w:bookmarkStart w:id="35" w:name="the-intervention-is-not-recommended"/>
     <w:p>
       <w:pPr>
         <w:pStyle w:val="Heading2"/>
@@ -604,8 +604,8 @@
         <w:t xml:space="preserve">recommend using this intervention.</w:t>
       </w:r>
     </w:p>
-    <w:bookmarkEnd w:id="24"/>
-    <w:bookmarkEnd w:id="25"/>
+    <w:bookmarkEnd w:id="35"/>
+    <w:bookmarkEnd w:id="36"/>
     <w:p>
       <w:pPr>
         <w:pStyle w:val="BodyText"/>
@@ -656,7 +656,7 @@
         <w:t xml:space="preserve">. This could be any kind of group, e.g. a racial, ethnic, religious, cultural, or economic group.</w:t>
       </w:r>
     </w:p>
-    <w:bookmarkStart w:id="29" w:name="cr-flowchart2"/>
+    <w:bookmarkStart w:id="40" w:name="cr-flowchart2"/>
     <w:p>
       <w:pPr>
         <w:pStyle w:val="BodyText"/>
@@ -669,20 +669,20 @@
       <w:r>
         <w:drawing>
           <wp:inline>
-            <wp:extent cx="2660904" cy="1709928"/>
+            <wp:extent cx="2688336" cy="1700784"/>
             <wp:effectExtent b="0" l="0" r="0" t="0"/>
-            <wp:docPr descr="" title="" id="27" name="Picture"/>
+            <wp:docPr descr="" title="" id="38" name="Picture"/>
             <a:graphic>
               <a:graphicData uri="http://schemas.openxmlformats.org/drawingml/2006/picture">
                 <pic:pic>
                   <pic:nvPicPr>
-                    <pic:cNvPr descr="be-less-wrong_files/figure-docx/mermaid-figure-2.png" id="28" name="Picture"/>
+                    <pic:cNvPr descr="be-less-wrong_files\figure-docx\mermaid-figure-2.png" id="39" name="Picture"/>
                     <pic:cNvPicPr>
                       <a:picLocks noChangeArrowheads="1" noChangeAspect="1"/>
                     </pic:cNvPicPr>
                   </pic:nvPicPr>
                   <pic:blipFill>
-                    <a:blip r:embed="rId26"/>
+                    <a:blip r:embed="rId37"/>
                     <a:stretch>
                       <a:fillRect/>
                     </a:stretch>
@@ -690,7 +690,7 @@
                   <pic:spPr bwMode="auto">
                     <a:xfrm>
                       <a:off x="0" y="0"/>
-                      <a:ext cx="2660904" cy="1709928"/>
+                      <a:ext cx="2688336" cy="1700784"/>
                     </a:xfrm>
                     <a:prstGeom prst="rect">
                       <a:avLst/>
@@ -714,7 +714,7 @@
         <w:pStyle w:val="BodyText"/>
       </w:pPr>
     </w:p>
-    <w:bookmarkEnd w:id="29"/>
+    <w:bookmarkEnd w:id="40"/>
     <w:p>
       <w:pPr>
         <w:pStyle w:val="BodyText"/>
@@ -723,7 +723,7 @@
         <w:t xml:space="preserve">Our conclusion seems to have flipped!</w:t>
       </w:r>
     </w:p>
-    <w:bookmarkStart w:id="30" w:name="the-intervention-is-recommended"/>
+    <w:bookmarkStart w:id="41" w:name="the-intervention-is-recommended"/>
     <w:p>
       <w:pPr>
         <w:pStyle w:val="Heading2"/>
@@ -756,8 +756,8 @@
         <w:t xml:space="preserve">recommend using this intervention.</w:t>
       </w:r>
     </w:p>
-    <w:bookmarkEnd w:id="30"/>
-    <w:bookmarkStart w:id="36" w:name="cr-p0-group"/>
+    <w:bookmarkEnd w:id="41"/>
+    <w:bookmarkStart w:id="47" w:name="cr-p0-group"/>
     <w:tbl>
       <w:tblPr>
         <w:tblStyle w:val="Table"/>
@@ -771,30 +771,30 @@
       <w:tr>
         <w:tc>
           <w:tcPr/>
-          <w:bookmarkStart w:id="35" w:name="fig-p0-group"/>
+          <w:bookmarkStart w:id="46" w:name="fig-p0-group"/>
           <w:p>
             <w:pPr>
               <w:pStyle w:val="Compact"/>
               <w:jc w:val="center"/>
             </w:pPr>
-            <w:bookmarkStart w:id="34" w:name="fig-p0-group"/>
+            <w:bookmarkStart w:id="45" w:name="fig-p0-group"/>
             <w:r>
               <w:drawing>
                 <wp:inline>
-                  <wp:extent cx="5334000" cy="3200400"/>
+                  <wp:extent cx="4620126" cy="2772075"/>
                   <wp:effectExtent b="0" l="0" r="0" t="0"/>
-                  <wp:docPr descr="" title="" id="32" name="Picture"/>
+                  <wp:docPr descr="" title="" id="43" name="Picture"/>
                   <a:graphic>
                     <a:graphicData uri="http://schemas.openxmlformats.org/drawingml/2006/picture">
                       <pic:pic>
                         <pic:nvPicPr>
-                          <pic:cNvPr descr="be-less-wrong_files/figure-docx/fig-p0-group-1.png" id="33" name="Picture"/>
+                          <pic:cNvPr descr="be-less-wrong_files/figure-docx/fig-p0-group-1.png" id="44" name="Picture"/>
                           <pic:cNvPicPr>
                             <a:picLocks noChangeArrowheads="1" noChangeAspect="1"/>
                           </pic:cNvPicPr>
                         </pic:nvPicPr>
                         <pic:blipFill>
-                          <a:blip r:embed="rId31"/>
+                          <a:blip r:embed="rId42"/>
                           <a:stretch>
                             <a:fillRect/>
                           </a:stretch>
@@ -802,7 +802,7 @@
                         <pic:spPr bwMode="auto">
                           <a:xfrm>
                             <a:off x="0" y="0"/>
-                            <a:ext cx="5334000" cy="3200400"/>
+                            <a:ext cx="4620126" cy="2772075"/>
                           </a:xfrm>
                           <a:prstGeom prst="rect">
                             <a:avLst/>
@@ -820,14 +820,14 @@
                 </wp:inline>
               </w:drawing>
             </w:r>
-            <w:bookmarkEnd w:id="34"/>
+            <w:bookmarkEnd w:id="45"/>
           </w:p>
           <w:p>
             <w:pPr>
               <w:jc w:val="center"/>
             </w:pPr>
             <w:pPr>
-              <w:jc w:val="left"/>
+              <w:jc w:val="start"/>
               <w:spacing w:before="200"/>
               <w:pStyle w:val="ImageCaption"/>
             </w:pPr>
@@ -835,11 +835,11 @@
               <w:t xml:space="preserve">Figure 2</w:t>
             </w:r>
           </w:p>
-          <w:bookmarkEnd w:id="35"/>
+          <w:bookmarkEnd w:id="46"/>
         </w:tc>
       </w:tr>
     </w:tbl>
-    <w:bookmarkEnd w:id="36"/>
+    <w:bookmarkEnd w:id="47"/>
     <w:p>
       <w:pPr>
         <w:pStyle w:val="BodyText"/>
@@ -860,11 +860,11 @@
         <w:rPr>
           <w:rStyle w:val="FootnoteReference"/>
         </w:rPr>
-        <w:footnoteReference w:id="37"/>
-      </w:r>
-    </w:p>
-    <w:bookmarkStart w:id="39" w:name="cr-Simpson"/>
-    <w:bookmarkStart w:id="38" w:name="simpsons-paradox"/>
+        <w:footnoteReference w:id="48"/>
+      </w:r>
+    </w:p>
+    <w:bookmarkStart w:id="50" w:name="cr-Simpson"/>
+    <w:bookmarkStart w:id="49" w:name="simpsons-paradox"/>
     <w:p>
       <w:pPr>
         <w:pStyle w:val="Heading2"/>
@@ -893,8 +893,8 @@
         <w:t xml:space="preserve">can change–sometimes quite dramatically–as we add more and more factors to our model.</w:t>
       </w:r>
     </w:p>
-    <w:bookmarkEnd w:id="38"/>
-    <w:bookmarkEnd w:id="39"/>
+    <w:bookmarkEnd w:id="49"/>
+    <w:bookmarkEnd w:id="50"/>
     <w:p>
       <w:pPr>
         <w:pStyle w:val="BodyText"/>
@@ -919,8 +919,8 @@
         <w:t xml:space="preserve">our conclusions.</w:t>
       </w:r>
     </w:p>
-    <w:bookmarkStart w:id="41" w:name="cr-multivariate"/>
-    <w:bookmarkStart w:id="40" w:name="multivariate-processes"/>
+    <w:bookmarkStart w:id="52" w:name="cr-multivariate"/>
+    <w:bookmarkStart w:id="51" w:name="multivariate-processes"/>
     <w:p>
       <w:pPr>
         <w:pStyle w:val="Heading2"/>
@@ -982,8 +982,8 @@
         <w:t xml:space="preserve">.</w:t>
       </w:r>
     </w:p>
-    <w:bookmarkEnd w:id="40"/>
-    <w:bookmarkEnd w:id="41"/>
+    <w:bookmarkEnd w:id="51"/>
+    <w:bookmarkEnd w:id="52"/>
     <w:p>
       <w:pPr>
         <w:pStyle w:val="BodyText"/>
@@ -1000,8 +1000,8 @@
         <w:t xml:space="preserve">Failure to include all of the relevant variables in our model–whether that model is visual or statistical–may lead to very wrong conclusions.</w:t>
       </w:r>
     </w:p>
-    <w:bookmarkStart w:id="43" w:name="cr-variables"/>
-    <w:bookmarkStart w:id="42" w:name="a-strategy-for-modeling"/>
+    <w:bookmarkStart w:id="54" w:name="cr-variables"/>
+    <w:bookmarkStart w:id="53" w:name="a-strategy-for-modeling"/>
     <w:p>
       <w:pPr>
         <w:pStyle w:val="Heading2"/>
@@ -1018,8 +1018,8 @@
         <w:t xml:space="preserve">If those variables are observed, and included in our data set, it may be straightforward to build them into our model. If those variables are not observed, and not present in our data set, more complicated modeling strategies may be necessary.</w:t>
       </w:r>
     </w:p>
-    <w:bookmarkEnd w:id="42"/>
-    <w:bookmarkEnd w:id="43"/>
+    <w:bookmarkEnd w:id="53"/>
+    <w:bookmarkEnd w:id="54"/>
     <w:p>
       <w:pPr>
         <w:pStyle w:val="BodyText"/>
@@ -1028,8 +1028,8 @@
         <w:t xml:space="preserve">At first the scenario I’ve just presented seems almost like a trick, or a puzzle, designed to confound us, or to illustrate a convoluted statistical scenario. Yet, upon reflection, the scenario I’ve just presented is surprisingly plausible.</w:t>
       </w:r>
     </w:p>
-    <w:bookmarkStart w:id="50" w:name="cr-thoughtexperiment"/>
-    <w:bookmarkStart w:id="49" w:name="a-thought-experiment"/>
+    <w:bookmarkStart w:id="61" w:name="cr-thoughtexperiment"/>
+    <w:bookmarkStart w:id="60" w:name="a-thought-experiment"/>
     <w:p>
       <w:pPr>
         <w:pStyle w:val="Heading2"/>
@@ -1090,30 +1090,30 @@
       <w:tr>
         <w:tc>
           <w:tcPr/>
-          <w:bookmarkStart w:id="48" w:name="fig-combined"/>
+          <w:bookmarkStart w:id="59" w:name="fig-combined"/>
           <w:p>
             <w:pPr>
               <w:pStyle w:val="Compact"/>
               <w:jc w:val="center"/>
             </w:pPr>
-            <w:bookmarkStart w:id="47" w:name="fig-combined"/>
+            <w:bookmarkStart w:id="58" w:name="fig-combined"/>
             <w:r>
               <w:drawing>
                 <wp:inline>
-                  <wp:extent cx="5334000" cy="3200400"/>
+                  <wp:extent cx="4620126" cy="2772075"/>
                   <wp:effectExtent b="0" l="0" r="0" t="0"/>
-                  <wp:docPr descr="" title="" id="45" name="Picture"/>
+                  <wp:docPr descr="" title="" id="56" name="Picture"/>
                   <a:graphic>
                     <a:graphicData uri="http://schemas.openxmlformats.org/drawingml/2006/picture">
                       <pic:pic>
                         <pic:nvPicPr>
-                          <pic:cNvPr descr="be-less-wrong_files/figure-docx/fig-combined-1.png" id="46" name="Picture"/>
+                          <pic:cNvPr descr="be-less-wrong_files/figure-docx/fig-combined-1.png" id="57" name="Picture"/>
                           <pic:cNvPicPr>
                             <a:picLocks noChangeArrowheads="1" noChangeAspect="1"/>
                           </pic:cNvPicPr>
                         </pic:nvPicPr>
                         <pic:blipFill>
-                          <a:blip r:embed="rId44"/>
+                          <a:blip r:embed="rId55"/>
                           <a:stretch>
                             <a:fillRect/>
                           </a:stretch>
@@ -1121,7 +1121,7 @@
                         <pic:spPr bwMode="auto">
                           <a:xfrm>
                             <a:off x="0" y="0"/>
-                            <a:ext cx="5334000" cy="3200400"/>
+                            <a:ext cx="4620126" cy="2772075"/>
                           </a:xfrm>
                           <a:prstGeom prst="rect">
                             <a:avLst/>
@@ -1139,14 +1139,14 @@
                 </wp:inline>
               </w:drawing>
             </w:r>
-            <w:bookmarkEnd w:id="47"/>
+            <w:bookmarkEnd w:id="58"/>
           </w:p>
           <w:p>
             <w:pPr>
               <w:jc w:val="center"/>
             </w:pPr>
             <w:pPr>
-              <w:jc w:val="left"/>
+              <w:jc w:val="start"/>
               <w:spacing w:before="200"/>
               <w:pStyle w:val="ImageCaption"/>
             </w:pPr>
@@ -1154,12 +1154,12 @@
               <w:t xml:space="preserve">Figure 3</w:t>
             </w:r>
           </w:p>
-          <w:bookmarkEnd w:id="48"/>
+          <w:bookmarkEnd w:id="59"/>
         </w:tc>
       </w:tr>
     </w:tbl>
-    <w:bookmarkEnd w:id="49"/>
-    <w:bookmarkEnd w:id="50"/>
+    <w:bookmarkEnd w:id="60"/>
+    <w:bookmarkEnd w:id="61"/>
     <w:p>
       <w:pPr>
         <w:pStyle w:val="BodyText"/>
@@ -1174,7 +1174,7 @@
         <w:rPr>
           <w:rStyle w:val="FootnoteReference"/>
         </w:rPr>
-        <w:footnoteReference w:id="51"/>
+        <w:footnoteReference w:id="62"/>
       </w:r>
       <m:oMath>
         <m:sSup>
@@ -1200,7 +1200,7 @@
         <w:rPr>
           <w:rStyle w:val="FootnoteReference"/>
         </w:rPr>
-        <w:footnoteReference w:id="52"/>
+        <w:footnoteReference w:id="63"/>
       </w:r>
       <m:oMath>
         <m:sSup>
@@ -1226,7 +1226,7 @@
         <w:rPr>
           <w:rStyle w:val="FootnoteReference"/>
         </w:rPr>
-        <w:footnoteReference w:id="53"/>
+        <w:footnoteReference w:id="64"/>
       </w:r>
     </w:p>
     <w:p>
@@ -1274,8 +1274,8 @@
         <w:t xml:space="preserve">.</w:t>
       </w:r>
     </w:p>
-    <w:bookmarkStart w:id="55" w:name="cr-belesswrong"/>
-    <w:bookmarkStart w:id="54" w:name="be-less-wrong"/>
+    <w:bookmarkStart w:id="66" w:name="cr-belesswrong"/>
+    <w:bookmarkStart w:id="65" w:name="be-less-wrong"/>
     <w:p>
       <w:pPr>
         <w:pStyle w:val="Heading2"/>
@@ -1292,10 +1292,10 @@
         <w:t xml:space="preserve">We need to keep the model as simple as possible so that it remains a useful abstraction, but to make the model complicated enough to reflect the complications of reality.</w:t>
       </w:r>
     </w:p>
-    <w:bookmarkEnd w:id="54"/>
-    <w:bookmarkEnd w:id="55"/>
-    <w:bookmarkStart w:id="84" w:name="refs"/>
-    <w:bookmarkStart w:id="56" w:name="ref-Antweiler2016"/>
+    <w:bookmarkEnd w:id="65"/>
+    <w:bookmarkEnd w:id="66"/>
+    <w:bookmarkStart w:id="95" w:name="refs"/>
+    <w:bookmarkStart w:id="67" w:name="ref-Antweiler2016"/>
     <w:p>
       <w:pPr>
         <w:pStyle w:val="Bibliography"/>
@@ -1317,8 +1317,8 @@
         <w:t xml:space="preserve">. Berghahn.</w:t>
       </w:r>
     </w:p>
-    <w:bookmarkEnd w:id="56"/>
-    <w:bookmarkStart w:id="57" w:name="ref-Box1979"/>
+    <w:bookmarkEnd w:id="67"/>
+    <w:bookmarkStart w:id="68" w:name="ref-Box1979"/>
     <w:p>
       <w:pPr>
         <w:pStyle w:val="Bibliography"/>
@@ -1340,14 +1340,14 @@
         <w:t xml:space="preserve">. Academic Press, Inc. [Harcourt Brace Jovanovich, Publishers], New York-London.</w:t>
       </w:r>
     </w:p>
-    <w:bookmarkEnd w:id="57"/>
-    <w:bookmarkStart w:id="59" w:name="ref-Button2013"/>
+    <w:bookmarkEnd w:id="68"/>
+    <w:bookmarkStart w:id="70" w:name="ref-Button2013"/>
     <w:p>
       <w:pPr>
         <w:pStyle w:val="Bibliography"/>
       </w:pPr>
       <w:r>
-        <w:t xml:space="preserve">Button, K. S., Ioannidis, J. P. A., Mokrysz, C., Nosek, B. A., Flint, J., Robinson, E. S. J., &amp; Munaf‘o, M. R. (2013). Power failure: Why small sample size undermines the reliability of neuroscience.</w:t>
+        <w:t xml:space="preserve">Button, K. S., Ioannidis, J. P. A., Mokrysz, C., Nosek, B. A., Flint, J., Robinson, E. S. J., &amp; Munafò, M. R. (2013). Power failure: Why small sample size undermines the reliability of neuroscience.</w:t>
       </w:r>
       <w:r>
         <w:t xml:space="preserve"> </w:t>
@@ -1378,7 +1378,7 @@
       <w:r>
         <w:t xml:space="preserve"> </w:t>
       </w:r>
-      <w:hyperlink r:id="rId58">
+      <w:hyperlink r:id="rId69">
         <w:r>
           <w:rPr>
             <w:rStyle w:val="Hyperlink"/>
@@ -1387,8 +1387,8 @@
         </w:r>
       </w:hyperlink>
     </w:p>
-    <w:bookmarkEnd w:id="59"/>
-    <w:bookmarkStart w:id="60" w:name="ref-DiezRoux2003"/>
+    <w:bookmarkEnd w:id="70"/>
+    <w:bookmarkStart w:id="71" w:name="ref-DiezRoux2003"/>
     <w:p>
       <w:pPr>
         <w:pStyle w:val="Bibliography"/>
@@ -1413,8 +1413,8 @@
         <w:t xml:space="preserve">(pp. 93–119). Kluwer Academic Publishers.</w:t>
       </w:r>
     </w:p>
-    <w:bookmarkEnd w:id="60"/>
-    <w:bookmarkStart w:id="62" w:name="ref-Draper2022"/>
+    <w:bookmarkEnd w:id="71"/>
+    <w:bookmarkStart w:id="73" w:name="ref-Draper2022"/>
     <w:p>
       <w:pPr>
         <w:pStyle w:val="Bibliography"/>
@@ -1451,7 +1451,7 @@
       <w:r>
         <w:t xml:space="preserve"> </w:t>
       </w:r>
-      <w:hyperlink r:id="rId61">
+      <w:hyperlink r:id="rId72">
         <w:r>
           <w:rPr>
             <w:rStyle w:val="Hyperlink"/>
@@ -1460,8 +1460,8 @@
         </w:r>
       </w:hyperlink>
     </w:p>
-    <w:bookmarkEnd w:id="62"/>
-    <w:bookmarkStart w:id="64" w:name="ref-Elwert2014"/>
+    <w:bookmarkEnd w:id="73"/>
+    <w:bookmarkStart w:id="75" w:name="ref-Elwert2014"/>
     <w:p>
       <w:pPr>
         <w:pStyle w:val="Bibliography"/>
@@ -1498,7 +1498,7 @@
       <w:r>
         <w:t xml:space="preserve"> </w:t>
       </w:r>
-      <w:hyperlink r:id="rId63">
+      <w:hyperlink r:id="rId74">
         <w:r>
           <w:rPr>
             <w:rStyle w:val="Hyperlink"/>
@@ -1507,8 +1507,8 @@
         </w:r>
       </w:hyperlink>
     </w:p>
-    <w:bookmarkEnd w:id="64"/>
-    <w:bookmarkStart w:id="66" w:name="ref-Gelman2007"/>
+    <w:bookmarkEnd w:id="75"/>
+    <w:bookmarkStart w:id="77" w:name="ref-Gelman2007"/>
     <w:p>
       <w:pPr>
         <w:pStyle w:val="Bibliography"/>
@@ -1554,7 +1554,7 @@
       <w:r>
         <w:t xml:space="preserve"> </w:t>
       </w:r>
-      <w:hyperlink r:id="rId65">
+      <w:hyperlink r:id="rId76">
         <w:r>
           <w:rPr>
             <w:rStyle w:val="Hyperlink"/>
@@ -1563,8 +1563,8 @@
         </w:r>
       </w:hyperlink>
     </w:p>
-    <w:bookmarkEnd w:id="66"/>
-    <w:bookmarkStart w:id="68" w:name="ref-Hand2014"/>
+    <w:bookmarkEnd w:id="77"/>
+    <w:bookmarkStart w:id="79" w:name="ref-Hand2014"/>
     <w:p>
       <w:pPr>
         <w:pStyle w:val="Bibliography"/>
@@ -1610,7 +1610,7 @@
       <w:r>
         <w:t xml:space="preserve"> </w:t>
       </w:r>
-      <w:hyperlink r:id="rId67">
+      <w:hyperlink r:id="rId78">
         <w:r>
           <w:rPr>
             <w:rStyle w:val="Hyperlink"/>
@@ -1619,8 +1619,8 @@
         </w:r>
       </w:hyperlink>
     </w:p>
-    <w:bookmarkEnd w:id="68"/>
-    <w:bookmarkStart w:id="70" w:name="ref-Henrich2010"/>
+    <w:bookmarkEnd w:id="79"/>
+    <w:bookmarkStart w:id="81" w:name="ref-Henrich2010"/>
     <w:p>
       <w:pPr>
         <w:pStyle w:val="Bibliography"/>
@@ -1650,7 +1650,7 @@
       <w:r>
         <w:t xml:space="preserve"> </w:t>
       </w:r>
-      <w:hyperlink r:id="rId69">
+      <w:hyperlink r:id="rId80">
         <w:r>
           <w:rPr>
             <w:rStyle w:val="Hyperlink"/>
@@ -1659,8 +1659,8 @@
         </w:r>
       </w:hyperlink>
     </w:p>
-    <w:bookmarkEnd w:id="70"/>
-    <w:bookmarkStart w:id="71" w:name="ref-MR0554183"/>
+    <w:bookmarkEnd w:id="81"/>
+    <w:bookmarkStart w:id="82" w:name="ref-MR0554183"/>
     <w:p>
       <w:pPr>
         <w:pStyle w:val="Bibliography"/>
@@ -1888,8 +1888,8 @@
         <w:t xml:space="preserve">(p. xvi+296). Academic Press, Inc. [Harcourt Brace Jovanovich, Publishers], New York-London.</w:t>
       </w:r>
     </w:p>
-    <w:bookmarkEnd w:id="71"/>
-    <w:bookmarkStart w:id="73" w:name="ref-Marang-vandeMheen2014"/>
+    <w:bookmarkEnd w:id="82"/>
+    <w:bookmarkStart w:id="84" w:name="ref-Marang-vandeMheen2014"/>
     <w:p>
       <w:pPr>
         <w:pStyle w:val="Bibliography"/>
@@ -1954,7 +1954,7 @@
       <w:r>
         <w:t xml:space="preserve"> </w:t>
       </w:r>
-      <w:hyperlink r:id="rId72">
+      <w:hyperlink r:id="rId83">
         <w:r>
           <w:rPr>
             <w:rStyle w:val="Hyperlink"/>
@@ -1963,8 +1963,8 @@
         </w:r>
       </w:hyperlink>
     </w:p>
-    <w:bookmarkEnd w:id="73"/>
-    <w:bookmarkStart w:id="74" w:name="ref-Martin-Baro1994B"/>
+    <w:bookmarkEnd w:id="84"/>
+    <w:bookmarkStart w:id="85" w:name="ref-Martin-Baro1994B"/>
     <w:p>
       <w:pPr>
         <w:pStyle w:val="Bibliography"/>
@@ -1986,8 +1986,8 @@
         <w:t xml:space="preserve">. Harvard University Press.</w:t>
       </w:r>
     </w:p>
-    <w:bookmarkEnd w:id="74"/>
-    <w:bookmarkStart w:id="76" w:name="ref-Nieuwenhuis2015"/>
+    <w:bookmarkEnd w:id="85"/>
+    <w:bookmarkStart w:id="87" w:name="ref-Nieuwenhuis2015"/>
     <w:p>
       <w:pPr>
         <w:pStyle w:val="Bibliography"/>
@@ -2024,7 +2024,7 @@
       <w:r>
         <w:t xml:space="preserve"> </w:t>
       </w:r>
-      <w:hyperlink r:id="rId75">
+      <w:hyperlink r:id="rId86">
         <w:r>
           <w:rPr>
             <w:rStyle w:val="Hyperlink"/>
@@ -2033,8 +2033,8 @@
         </w:r>
       </w:hyperlink>
     </w:p>
-    <w:bookmarkEnd w:id="76"/>
-    <w:bookmarkStart w:id="78" w:name="ref-Norton2015"/>
+    <w:bookmarkEnd w:id="87"/>
+    <w:bookmarkStart w:id="89" w:name="ref-Norton2015"/>
     <w:p>
       <w:pPr>
         <w:pStyle w:val="Bibliography"/>
@@ -2071,7 +2071,7 @@
       <w:r>
         <w:t xml:space="preserve"> </w:t>
       </w:r>
-      <w:hyperlink r:id="rId77">
+      <w:hyperlink r:id="rId88">
         <w:r>
           <w:rPr>
             <w:rStyle w:val="Hyperlink"/>
@@ -2080,8 +2080,8 @@
         </w:r>
       </w:hyperlink>
     </w:p>
-    <w:bookmarkEnd w:id="78"/>
-    <w:bookmarkStart w:id="79" w:name="ref-Silverman1998"/>
+    <w:bookmarkEnd w:id="89"/>
+    <w:bookmarkStart w:id="90" w:name="ref-Silverman1998"/>
     <w:p>
       <w:pPr>
         <w:pStyle w:val="Bibliography"/>
@@ -2103,8 +2103,8 @@
         <w:t xml:space="preserve">. Oxford University Press.</w:t>
       </w:r>
     </w:p>
-    <w:bookmarkEnd w:id="79"/>
-    <w:bookmarkStart w:id="81" w:name="ref-Simpson1951"/>
+    <w:bookmarkEnd w:id="90"/>
+    <w:bookmarkStart w:id="92" w:name="ref-Simpson1951"/>
     <w:p>
       <w:pPr>
         <w:pStyle w:val="Bibliography"/>
@@ -2141,7 +2141,7 @@
       <w:r>
         <w:t xml:space="preserve"> </w:t>
       </w:r>
-      <w:hyperlink r:id="rId80">
+      <w:hyperlink r:id="rId91">
         <w:r>
           <w:rPr>
             <w:rStyle w:val="Hyperlink"/>
@@ -2150,8 +2150,8 @@
         </w:r>
       </w:hyperlink>
     </w:p>
-    <w:bookmarkEnd w:id="81"/>
-    <w:bookmarkStart w:id="83" w:name="ref-Westreich2013"/>
+    <w:bookmarkEnd w:id="92"/>
+    <w:bookmarkStart w:id="94" w:name="ref-Westreich2013"/>
     <w:p>
       <w:pPr>
         <w:pStyle w:val="Bibliography"/>
@@ -2188,7 +2188,7 @@
       <w:r>
         <w:t xml:space="preserve"> </w:t>
       </w:r>
-      <w:hyperlink r:id="rId82">
+      <w:hyperlink r:id="rId93">
         <w:r>
           <w:rPr>
             <w:rStyle w:val="Hyperlink"/>
@@ -2197,8 +2197,8 @@
         </w:r>
       </w:hyperlink>
     </w:p>
-    <w:bookmarkEnd w:id="83"/>
-    <w:bookmarkEnd w:id="84"/>
+    <w:bookmarkEnd w:id="94"/>
+    <w:bookmarkEnd w:id="95"/>
     <w:sectPr>
       <w:footnotePr>
         <w:numRestart w:val="eachSect"/>
@@ -2228,7 +2228,7 @@
       </w:r>
     </w:p>
   </w:footnote>
-  <w:footnote w:id="37">
+  <w:footnote w:id="48">
     <w:p>
       <w:pPr>
         <w:pStyle w:val="FootnoteText"/>
@@ -2272,7 +2272,7 @@
       </w:r>
     </w:p>
   </w:footnote>
-  <w:footnote w:id="51">
+  <w:footnote w:id="62">
     <w:p>
       <w:pPr>
         <w:pStyle w:val="FootnoteText"/>
@@ -2320,7 +2320,7 @@
       </w:r>
     </w:p>
   </w:footnote>
-  <w:footnote w:id="52">
+  <w:footnote w:id="63">
     <w:p>
       <w:pPr>
         <w:pStyle w:val="FootnoteText"/>
@@ -2769,7 +2769,7 @@
       </w:r>
     </w:p>
   </w:footnote>
-  <w:footnote w:id="53">
+  <w:footnote w:id="64">
     <w:p>
       <w:pPr>
         <w:pStyle w:val="FootnoteText"/>
@@ -3126,10 +3126,10 @@
   <w:docDefaults>
     <w:rPrDefault>
       <w:rPr>
-        <w:rFonts w:asciiTheme="minorHAnsi" w:cstheme="minorBidi" w:eastAsiaTheme="minorEastAsia" w:hAnsiTheme="minorHAnsi"/>
+        <w:rFonts w:asciiTheme="minorHAnsi" w:cstheme="minorBidi" w:eastAsiaTheme="minorHAnsi" w:hAnsiTheme="minorHAnsi"/>
         <w:sz w:val="24"/>
         <w:szCs w:val="24"/>
-        <w:lang w:bidi="ar-SA" w:eastAsia="zh-CN" w:val="en-US"/>
+        <w:lang w:bidi="ar-SA" w:eastAsia="en-US" w:val="en-US"/>
       </w:rPr>
     </w:rPrDefault>
     <w:pPrDefault>
@@ -3670,6 +3670,13 @@
       </w:tblCellMar>
     </w:tblPr>
     <w:tblStylePr w:type="firstRow">
+      <w:tblPr>
+        <w:jc w:val="left"/>
+        <w:tblInd w:type="dxa" w:w="0"/>
+      </w:tblPr>
+      <w:trPr>
+        <w:jc w:val="left"/>
+      </w:trPr>
       <w:tcPr>
         <w:tcBorders>
           <w:bottom w:val="single"/>

</xml_diff>

<commit_message>
add MacKinnon & Lamp (2021)
</commit_message>
<xml_diff>
--- a/be-less-wrong/be-less-wrong.docx
+++ b/be-less-wrong/be-less-wrong.docx
@@ -31,7 +31,7 @@
         <w:pStyle w:val="Date"/>
       </w:pPr>
       <w:r>
-        <w:t xml:space="preserve">2026-04-29</w:t>
+        <w:t xml:space="preserve">2026-06-17</w:t>
       </w:r>
     </w:p>
     <w:p>
@@ -351,7 +351,7 @@
       <w:r>
         <w:drawing>
           <wp:inline>
-            <wp:extent cx="2670048" cy="694944"/>
+            <wp:extent cx="2670048" cy="685800"/>
             <wp:effectExtent b="0" l="0" r="0" t="0"/>
             <wp:docPr descr="" title="" id="15" name="Picture"/>
             <a:graphic>
@@ -372,7 +372,7 @@
                   <pic:spPr bwMode="auto">
                     <a:xfrm>
                       <a:off x="0" y="0"/>
-                      <a:ext cx="2670048" cy="694944"/>
+                      <a:ext cx="2670048" cy="685800"/>
                     </a:xfrm>
                     <a:prstGeom prst="rect">
                       <a:avLst/>
@@ -669,7 +669,7 @@
       <w:r>
         <w:drawing>
           <wp:inline>
-            <wp:extent cx="2679192" cy="1700784"/>
+            <wp:extent cx="2670048" cy="1709928"/>
             <wp:effectExtent b="0" l="0" r="0" t="0"/>
             <wp:docPr descr="" title="" id="27" name="Picture"/>
             <a:graphic>
@@ -690,7 +690,7 @@
                   <pic:spPr bwMode="auto">
                     <a:xfrm>
                       <a:off x="0" y="0"/>
-                      <a:ext cx="2679192" cy="1700784"/>
+                      <a:ext cx="2670048" cy="1709928"/>
                     </a:xfrm>
                     <a:prstGeom prst="rect">
                       <a:avLst/>
@@ -1294,7 +1294,7 @@
     </w:p>
     <w:bookmarkEnd w:id="54"/>
     <w:bookmarkEnd w:id="55"/>
-    <w:bookmarkStart w:id="84" w:name="refs"/>
+    <w:bookmarkStart w:id="86" w:name="refs"/>
     <w:bookmarkStart w:id="56" w:name="ref-Antweiler2016"/>
     <w:p>
       <w:pPr>
@@ -1889,12 +1889,59 @@
       </w:r>
     </w:p>
     <w:bookmarkEnd w:id="71"/>
-    <w:bookmarkStart w:id="73" w:name="ref-Marang-vandeMheen2014"/>
+    <w:bookmarkStart w:id="73" w:name="ref-MacKinnon2021"/>
     <w:p>
       <w:pPr>
         <w:pStyle w:val="Bibliography"/>
       </w:pPr>
       <w:r>
+        <w:t xml:space="preserve">MacKinnon, D. P., &amp; Lamp, S. J. (2021). A unification of mediator, confounder, and collider effects.</w:t>
+      </w:r>
+      <w:r>
+        <w:t xml:space="preserve"> </w:t>
+      </w:r>
+      <w:r>
+        <w:rPr>
+          <w:i/>
+          <w:iCs/>
+        </w:rPr>
+        <w:t xml:space="preserve">Prevention Science</w:t>
+      </w:r>
+      <w:r>
+        <w:t xml:space="preserve">,</w:t>
+      </w:r>
+      <w:r>
+        <w:t xml:space="preserve"> </w:t>
+      </w:r>
+      <w:r>
+        <w:rPr>
+          <w:i/>
+          <w:iCs/>
+        </w:rPr>
+        <w:t xml:space="preserve">22</w:t>
+      </w:r>
+      <w:r>
+        <w:t xml:space="preserve">, 1185–1193.</w:t>
+      </w:r>
+      <w:r>
+        <w:t xml:space="preserve"> </w:t>
+      </w:r>
+      <w:hyperlink r:id="rId72">
+        <w:r>
+          <w:rPr>
+            <w:rStyle w:val="Hyperlink"/>
+          </w:rPr>
+          <w:t xml:space="preserve">https://doi.org/10.1007/s11121-021-01268-x</w:t>
+        </w:r>
+      </w:hyperlink>
+    </w:p>
+    <w:bookmarkEnd w:id="73"/>
+    <w:bookmarkStart w:id="75" w:name="ref-Marang-vandeMheen2014"/>
+    <w:p>
+      <w:pPr>
+        <w:pStyle w:val="Bibliography"/>
+      </w:pPr>
+      <w:r>
         <w:t xml:space="preserve">Marang-van de Mheen, P. J., &amp; Shojania, K. G. (2014). Simpson’s paradox: How performance measurement can fail even with perfect risk adjustment.</w:t>
       </w:r>
       <w:r>
@@ -1954,7 +2001,7 @@
       <w:r>
         <w:t xml:space="preserve"> </w:t>
       </w:r>
-      <w:hyperlink r:id="rId72">
+      <w:hyperlink r:id="rId74">
         <w:r>
           <w:rPr>
             <w:rStyle w:val="Hyperlink"/>
@@ -1963,8 +2010,8 @@
         </w:r>
       </w:hyperlink>
     </w:p>
-    <w:bookmarkEnd w:id="73"/>
-    <w:bookmarkStart w:id="74" w:name="ref-Martin-Baro1994B"/>
+    <w:bookmarkEnd w:id="75"/>
+    <w:bookmarkStart w:id="76" w:name="ref-Martin-Baro1994B"/>
     <w:p>
       <w:pPr>
         <w:pStyle w:val="Bibliography"/>
@@ -1986,8 +2033,8 @@
         <w:t xml:space="preserve">. Harvard University Press.</w:t>
       </w:r>
     </w:p>
-    <w:bookmarkEnd w:id="74"/>
-    <w:bookmarkStart w:id="76" w:name="ref-Nieuwenhuis2015"/>
+    <w:bookmarkEnd w:id="76"/>
+    <w:bookmarkStart w:id="78" w:name="ref-Nieuwenhuis2015"/>
     <w:p>
       <w:pPr>
         <w:pStyle w:val="Bibliography"/>
@@ -2024,7 +2071,7 @@
       <w:r>
         <w:t xml:space="preserve"> </w:t>
       </w:r>
-      <w:hyperlink r:id="rId75">
+      <w:hyperlink r:id="rId77">
         <w:r>
           <w:rPr>
             <w:rStyle w:val="Hyperlink"/>
@@ -2033,8 +2080,8 @@
         </w:r>
       </w:hyperlink>
     </w:p>
-    <w:bookmarkEnd w:id="76"/>
-    <w:bookmarkStart w:id="78" w:name="ref-Norton2015"/>
+    <w:bookmarkEnd w:id="78"/>
+    <w:bookmarkStart w:id="80" w:name="ref-Norton2015"/>
     <w:p>
       <w:pPr>
         <w:pStyle w:val="Bibliography"/>
@@ -2071,7 +2118,7 @@
       <w:r>
         <w:t xml:space="preserve"> </w:t>
       </w:r>
-      <w:hyperlink r:id="rId77">
+      <w:hyperlink r:id="rId79">
         <w:r>
           <w:rPr>
             <w:rStyle w:val="Hyperlink"/>
@@ -2080,8 +2127,8 @@
         </w:r>
       </w:hyperlink>
     </w:p>
-    <w:bookmarkEnd w:id="78"/>
-    <w:bookmarkStart w:id="79" w:name="ref-Silverman1998"/>
+    <w:bookmarkEnd w:id="80"/>
+    <w:bookmarkStart w:id="81" w:name="ref-Silverman1998"/>
     <w:p>
       <w:pPr>
         <w:pStyle w:val="Bibliography"/>
@@ -2103,8 +2150,8 @@
         <w:t xml:space="preserve">. Oxford University Press.</w:t>
       </w:r>
     </w:p>
-    <w:bookmarkEnd w:id="79"/>
-    <w:bookmarkStart w:id="81" w:name="ref-Simpson1951"/>
+    <w:bookmarkEnd w:id="81"/>
+    <w:bookmarkStart w:id="83" w:name="ref-Simpson1951"/>
     <w:p>
       <w:pPr>
         <w:pStyle w:val="Bibliography"/>
@@ -2141,7 +2188,7 @@
       <w:r>
         <w:t xml:space="preserve"> </w:t>
       </w:r>
-      <w:hyperlink r:id="rId80">
+      <w:hyperlink r:id="rId82">
         <w:r>
           <w:rPr>
             <w:rStyle w:val="Hyperlink"/>
@@ -2150,8 +2197,8 @@
         </w:r>
       </w:hyperlink>
     </w:p>
-    <w:bookmarkEnd w:id="81"/>
-    <w:bookmarkStart w:id="83" w:name="ref-Westreich2013"/>
+    <w:bookmarkEnd w:id="83"/>
+    <w:bookmarkStart w:id="85" w:name="ref-Westreich2013"/>
     <w:p>
       <w:pPr>
         <w:pStyle w:val="Bibliography"/>
@@ -2188,7 +2235,7 @@
       <w:r>
         <w:t xml:space="preserve"> </w:t>
       </w:r>
-      <w:hyperlink r:id="rId82">
+      <w:hyperlink r:id="rId84">
         <w:r>
           <w:rPr>
             <w:rStyle w:val="Hyperlink"/>
@@ -2197,8 +2244,8 @@
         </w:r>
       </w:hyperlink>
     </w:p>
-    <w:bookmarkEnd w:id="83"/>
-    <w:bookmarkEnd w:id="84"/>
+    <w:bookmarkEnd w:id="85"/>
+    <w:bookmarkEnd w:id="86"/>
     <w:sectPr>
       <w:footnotePr>
         <w:numRestart w:val="eachSect"/>
@@ -2654,7 +2701,7 @@
         <w:t xml:space="preserve"> </w:t>
       </w:r>
       <w:r>
-        <w:t xml:space="preserve">(CF Westreich &amp; Greenland, 2013)</w:t>
+        <w:t xml:space="preserve">(CF Westreich &amp; Greenland, 2013; MacKinnon &amp; Lamp, 2021)</w:t>
       </w:r>
       <w:r>
         <w:t xml:space="preserve">. Including a variable</w:t>
@@ -2762,7 +2809,7 @@
         <w:t xml:space="preserve"> </w:t>
       </w:r>
       <w:r>
-        <w:t xml:space="preserve">(Elwert &amp; Winship, 2014)</w:t>
+        <w:t xml:space="preserve">(Elwert &amp; Winship, 2014; MacKinnon &amp; Lamp, 2021)</w:t>
       </w:r>
       <w:r>
         <w:t xml:space="preserve">.</w:t>

</xml_diff>